<commit_message>
change tests to work for windows, add 429 img
</commit_message>
<xml_diff>
--- a/docx/lab5.docx
+++ b/docx/lab5.docx
@@ -498,8 +498,8 @@
           <w:noProof/>
         </w:rPr>
         <w:drawing>
-          <wp:inline distT="0" distB="0" distL="0" distR="0" wp14:anchorId="7F519AC2" wp14:editId="7BA8D8E3">
-            <wp:extent cx="6120765" cy="1762125"/>
+          <wp:inline distT="0" distB="0" distL="0" distR="0" wp14:anchorId="697C1CEB" wp14:editId="7660313B">
+            <wp:extent cx="6120765" cy="1685925"/>
             <wp:effectExtent l="0" t="0" r="0" b="9525"/>
             <wp:docPr id="1" name="Picture 1"/>
             <wp:cNvGraphicFramePr>
@@ -521,7 +521,7 @@
                   <pic:spPr>
                     <a:xfrm>
                       <a:off x="0" y="0"/>
-                      <a:ext cx="6120765" cy="1762125"/>
+                      <a:ext cx="6120765" cy="1685925"/>
                     </a:xfrm>
                     <a:prstGeom prst="rect">
                       <a:avLst/>
@@ -539,44 +539,3250 @@
         <w:rPr>
           <w:b/>
           <w:bCs/>
-        </w:rPr>
-      </w:pPr>
-    </w:p>
-    <w:p>
-      <w:r>
+          <w:lang w:val="en-US"/>
+        </w:rPr>
+      </w:pPr>
+      <w:r>
+        <w:rPr>
+          <w:noProof/>
+        </w:rPr>
+        <w:drawing>
+          <wp:inline distT="0" distB="0" distL="0" distR="0" wp14:anchorId="33C4F274" wp14:editId="6DBC8964">
+            <wp:extent cx="6120765" cy="867410"/>
+            <wp:effectExtent l="0" t="0" r="0" b="8890"/>
+            <wp:docPr id="2" name="Picture 2"/>
+            <wp:cNvGraphicFramePr>
+              <a:graphicFrameLocks xmlns:a="http://schemas.openxmlformats.org/drawingml/2006/main" noChangeAspect="1"/>
+            </wp:cNvGraphicFramePr>
+            <a:graphic xmlns:a="http://schemas.openxmlformats.org/drawingml/2006/main">
+              <a:graphicData uri="http://schemas.openxmlformats.org/drawingml/2006/picture">
+                <pic:pic xmlns:pic="http://schemas.openxmlformats.org/drawingml/2006/picture">
+                  <pic:nvPicPr>
+                    <pic:cNvPr id="1" name=""/>
+                    <pic:cNvPicPr/>
+                  </pic:nvPicPr>
+                  <pic:blipFill>
+                    <a:blip r:embed="rId5"/>
+                    <a:stretch>
+                      <a:fillRect/>
+                    </a:stretch>
+                  </pic:blipFill>
+                  <pic:spPr>
+                    <a:xfrm>
+                      <a:off x="0" y="0"/>
+                      <a:ext cx="6120765" cy="867410"/>
+                    </a:xfrm>
+                    <a:prstGeom prst="rect">
+                      <a:avLst/>
+                    </a:prstGeom>
+                  </pic:spPr>
+                </pic:pic>
+              </a:graphicData>
+            </a:graphic>
+          </wp:inline>
+        </w:drawing>
+      </w:r>
+    </w:p>
+    <w:p>
+      <w:pPr>
         <w:rPr>
           <w:b/>
           <w:bCs/>
-        </w:rPr>
-        <w:t>Висновок</w:t>
-      </w:r>
-      <w:r>
+          <w:lang w:val="en-US"/>
+        </w:rPr>
+      </w:pPr>
+    </w:p>
+    <w:p>
+      <w:pPr>
         <w:rPr>
           <w:b/>
           <w:bCs/>
           <w:lang w:val="en-US"/>
         </w:rPr>
-        <w:t>:</w:t>
-      </w:r>
-      <w:r>
+      </w:pPr>
+      <w:r>
+        <w:rPr>
+          <w:noProof/>
+        </w:rPr>
+        <w:lastRenderedPageBreak/>
+        <w:drawing>
+          <wp:inline distT="0" distB="0" distL="0" distR="0" wp14:anchorId="3AC8A45A" wp14:editId="156A48D0">
+            <wp:extent cx="5038440" cy="4476750"/>
+            <wp:effectExtent l="0" t="0" r="0" b="0"/>
+            <wp:docPr id="3" name="Picture 3"/>
+            <wp:cNvGraphicFramePr>
+              <a:graphicFrameLocks xmlns:a="http://schemas.openxmlformats.org/drawingml/2006/main" noChangeAspect="1"/>
+            </wp:cNvGraphicFramePr>
+            <a:graphic xmlns:a="http://schemas.openxmlformats.org/drawingml/2006/main">
+              <a:graphicData uri="http://schemas.openxmlformats.org/drawingml/2006/picture">
+                <pic:pic xmlns:pic="http://schemas.openxmlformats.org/drawingml/2006/picture">
+                  <pic:nvPicPr>
+                    <pic:cNvPr id="1" name=""/>
+                    <pic:cNvPicPr/>
+                  </pic:nvPicPr>
+                  <pic:blipFill>
+                    <a:blip r:embed="rId6"/>
+                    <a:stretch>
+                      <a:fillRect/>
+                    </a:stretch>
+                  </pic:blipFill>
+                  <pic:spPr>
+                    <a:xfrm>
+                      <a:off x="0" y="0"/>
+                      <a:ext cx="5041974" cy="4479890"/>
+                    </a:xfrm>
+                    <a:prstGeom prst="rect">
+                      <a:avLst/>
+                    </a:prstGeom>
+                  </pic:spPr>
+                </pic:pic>
+              </a:graphicData>
+            </a:graphic>
+          </wp:inline>
+        </w:drawing>
+      </w:r>
+    </w:p>
+    <w:p>
+      <w:pPr>
         <w:rPr>
           <w:b/>
           <w:bCs/>
           <w:lang w:val="en-US"/>
         </w:rPr>
+      </w:pPr>
+      <w:r>
+        <w:rPr>
+          <w:noProof/>
+        </w:rPr>
+        <w:drawing>
+          <wp:inline distT="0" distB="0" distL="0" distR="0" wp14:anchorId="69D1DD40" wp14:editId="77186060">
+            <wp:extent cx="5162550" cy="4464141"/>
+            <wp:effectExtent l="0" t="0" r="0" b="0"/>
+            <wp:docPr id="4" name="Picture 4"/>
+            <wp:cNvGraphicFramePr>
+              <a:graphicFrameLocks xmlns:a="http://schemas.openxmlformats.org/drawingml/2006/main" noChangeAspect="1"/>
+            </wp:cNvGraphicFramePr>
+            <a:graphic xmlns:a="http://schemas.openxmlformats.org/drawingml/2006/main">
+              <a:graphicData uri="http://schemas.openxmlformats.org/drawingml/2006/picture">
+                <pic:pic xmlns:pic="http://schemas.openxmlformats.org/drawingml/2006/picture">
+                  <pic:nvPicPr>
+                    <pic:cNvPr id="1" name=""/>
+                    <pic:cNvPicPr/>
+                  </pic:nvPicPr>
+                  <pic:blipFill>
+                    <a:blip r:embed="rId7"/>
+                    <a:stretch>
+                      <a:fillRect/>
+                    </a:stretch>
+                  </pic:blipFill>
+                  <pic:spPr>
+                    <a:xfrm>
+                      <a:off x="0" y="0"/>
+                      <a:ext cx="5165035" cy="4466290"/>
+                    </a:xfrm>
+                    <a:prstGeom prst="rect">
+                      <a:avLst/>
+                    </a:prstGeom>
+                  </pic:spPr>
+                </pic:pic>
+              </a:graphicData>
+            </a:graphic>
+          </wp:inline>
+        </w:drawing>
+      </w:r>
+    </w:p>
+    <w:p>
+      <w:pPr>
+        <w:rPr>
+          <w:b/>
+          <w:bCs/>
+          <w:lang w:val="en-US"/>
+        </w:rPr>
+      </w:pPr>
+      <w:r>
+        <w:rPr>
+          <w:noProof/>
+        </w:rPr>
+        <w:lastRenderedPageBreak/>
+        <w:drawing>
+          <wp:inline distT="0" distB="0" distL="0" distR="0" wp14:anchorId="4EFE3948" wp14:editId="09E8612B">
+            <wp:extent cx="5781675" cy="5286375"/>
+            <wp:effectExtent l="0" t="0" r="9525" b="9525"/>
+            <wp:docPr id="5" name="Picture 5"/>
+            <wp:cNvGraphicFramePr>
+              <a:graphicFrameLocks xmlns:a="http://schemas.openxmlformats.org/drawingml/2006/main" noChangeAspect="1"/>
+            </wp:cNvGraphicFramePr>
+            <a:graphic xmlns:a="http://schemas.openxmlformats.org/drawingml/2006/main">
+              <a:graphicData uri="http://schemas.openxmlformats.org/drawingml/2006/picture">
+                <pic:pic xmlns:pic="http://schemas.openxmlformats.org/drawingml/2006/picture">
+                  <pic:nvPicPr>
+                    <pic:cNvPr id="1" name=""/>
+                    <pic:cNvPicPr/>
+                  </pic:nvPicPr>
+                  <pic:blipFill>
+                    <a:blip r:embed="rId8"/>
+                    <a:stretch>
+                      <a:fillRect/>
+                    </a:stretch>
+                  </pic:blipFill>
+                  <pic:spPr>
+                    <a:xfrm>
+                      <a:off x="0" y="0"/>
+                      <a:ext cx="5781675" cy="5286375"/>
+                    </a:xfrm>
+                    <a:prstGeom prst="rect">
+                      <a:avLst/>
+                    </a:prstGeom>
+                  </pic:spPr>
+                </pic:pic>
+              </a:graphicData>
+            </a:graphic>
+          </wp:inline>
+        </w:drawing>
+      </w:r>
+    </w:p>
+    <w:p>
+      <w:pPr>
+        <w:rPr>
+          <w:lang w:val="en-US"/>
+        </w:rPr>
+      </w:pPr>
+      <w:r>
+        <w:rPr>
+          <mc:AlternateContent>
+            <mc:Choice Requires="w16se"/>
+            <mc:Fallback>
+              <w:rFonts w:ascii="Segoe UI Emoji" w:eastAsia="Segoe UI Emoji" w:hAnsi="Segoe UI Emoji" w:cs="Segoe UI Emoji"/>
+            </mc:Fallback>
+          </mc:AlternateContent>
+          <w:lang w:val="en-US"/>
+        </w:rPr>
+        <mc:AlternateContent>
+          <mc:Choice Requires="w16se">
+            <w16se:symEx w16se:font="Segoe UI Emoji" w16se:char="1F63D"/>
+          </mc:Choice>
+          <mc:Fallback>
+            <w:t>😽</w:t>
+          </mc:Fallback>
+        </mc:AlternateContent>
+      </w:r>
+      <w:r>
+        <w:rPr>
+          <mc:AlternateContent>
+            <mc:Choice Requires="w16se"/>
+            <mc:Fallback>
+              <w:rFonts w:ascii="Segoe UI Emoji" w:eastAsia="Segoe UI Emoji" w:hAnsi="Segoe UI Emoji" w:cs="Segoe UI Emoji"/>
+            </mc:Fallback>
+          </mc:AlternateContent>
+          <w:lang w:val="en-US"/>
+        </w:rPr>
+        <mc:AlternateContent>
+          <mc:Choice Requires="w16se">
+            <w16se:symEx w16se:font="Segoe UI Emoji" w16se:char="1F63D"/>
+          </mc:Choice>
+          <mc:Fallback>
+            <w:t>😽</w:t>
+          </mc:Fallback>
+        </mc:AlternateContent>
+      </w:r>
+      <w:r>
+        <w:rPr>
+          <mc:AlternateContent>
+            <mc:Choice Requires="w16se"/>
+            <mc:Fallback>
+              <w:rFonts w:ascii="Segoe UI Emoji" w:eastAsia="Segoe UI Emoji" w:hAnsi="Segoe UI Emoji" w:cs="Segoe UI Emoji"/>
+            </mc:Fallback>
+          </mc:AlternateContent>
+          <w:lang w:val="en-US"/>
+        </w:rPr>
+        <mc:AlternateContent>
+          <mc:Choice Requires="w16se">
+            <w16se:symEx w16se:font="Segoe UI Emoji" w16se:char="1F63D"/>
+          </mc:Choice>
+          <mc:Fallback>
+            <w:t>😽</w:t>
+          </mc:Fallback>
+        </mc:AlternateContent>
+      </w:r>
+      <w:r>
+        <w:rPr>
+          <mc:AlternateContent>
+            <mc:Choice Requires="w16se"/>
+            <mc:Fallback>
+              <w:rFonts w:ascii="Segoe UI Emoji" w:eastAsia="Segoe UI Emoji" w:hAnsi="Segoe UI Emoji" w:cs="Segoe UI Emoji"/>
+            </mc:Fallback>
+          </mc:AlternateContent>
+          <w:lang w:val="en-US"/>
+        </w:rPr>
+        <mc:AlternateContent>
+          <mc:Choice Requires="w16se">
+            <w16se:symEx w16se:font="Segoe UI Emoji" w16se:char="1F63D"/>
+          </mc:Choice>
+          <mc:Fallback>
+            <w:t>😽</w:t>
+          </mc:Fallback>
+        </mc:AlternateContent>
+      </w:r>
+      <w:r>
+        <w:rPr>
+          <mc:AlternateContent>
+            <mc:Choice Requires="w16se"/>
+            <mc:Fallback>
+              <w:rFonts w:ascii="Segoe UI Emoji" w:eastAsia="Segoe UI Emoji" w:hAnsi="Segoe UI Emoji" w:cs="Segoe UI Emoji"/>
+            </mc:Fallback>
+          </mc:AlternateContent>
+          <w:lang w:val="en-US"/>
+        </w:rPr>
+        <mc:AlternateContent>
+          <mc:Choice Requires="w16se">
+            <w16se:symEx w16se:font="Segoe UI Emoji" w16se:char="1F63D"/>
+          </mc:Choice>
+          <mc:Fallback>
+            <w:t>😽</w:t>
+          </mc:Fallback>
+        </mc:AlternateContent>
+      </w:r>
+      <w:r>
+        <w:rPr>
+          <mc:AlternateContent>
+            <mc:Choice Requires="w16se"/>
+            <mc:Fallback>
+              <w:rFonts w:ascii="Segoe UI Emoji" w:eastAsia="Segoe UI Emoji" w:hAnsi="Segoe UI Emoji" w:cs="Segoe UI Emoji"/>
+            </mc:Fallback>
+          </mc:AlternateContent>
+          <w:lang w:val="en-US"/>
+        </w:rPr>
+        <mc:AlternateContent>
+          <mc:Choice Requires="w16se">
+            <w16se:symEx w16se:font="Segoe UI Emoji" w16se:char="1F63D"/>
+          </mc:Choice>
+          <mc:Fallback>
+            <w:t>😽</w:t>
+          </mc:Fallback>
+        </mc:AlternateContent>
+      </w:r>
+      <w:r>
+        <w:rPr>
+          <mc:AlternateContent>
+            <mc:Choice Requires="w16se"/>
+            <mc:Fallback>
+              <w:rFonts w:ascii="Segoe UI Emoji" w:eastAsia="Segoe UI Emoji" w:hAnsi="Segoe UI Emoji" w:cs="Segoe UI Emoji"/>
+            </mc:Fallback>
+          </mc:AlternateContent>
+          <w:lang w:val="en-US"/>
+        </w:rPr>
+        <mc:AlternateContent>
+          <mc:Choice Requires="w16se">
+            <w16se:symEx w16se:font="Segoe UI Emoji" w16se:char="1F63D"/>
+          </mc:Choice>
+          <mc:Fallback>
+            <w:t>😽</w:t>
+          </mc:Fallback>
+        </mc:AlternateContent>
+      </w:r>
+      <w:r>
+        <w:rPr>
+          <mc:AlternateContent>
+            <mc:Choice Requires="w16se"/>
+            <mc:Fallback>
+              <w:rFonts w:ascii="Segoe UI Emoji" w:eastAsia="Segoe UI Emoji" w:hAnsi="Segoe UI Emoji" w:cs="Segoe UI Emoji"/>
+            </mc:Fallback>
+          </mc:AlternateContent>
+          <w:lang w:val="en-US"/>
+        </w:rPr>
+        <mc:AlternateContent>
+          <mc:Choice Requires="w16se">
+            <w16se:symEx w16se:font="Segoe UI Emoji" w16se:char="1F63D"/>
+          </mc:Choice>
+          <mc:Fallback>
+            <w:t>😽</w:t>
+          </mc:Fallback>
+        </mc:AlternateContent>
+      </w:r>
+      <w:r>
+        <w:rPr>
+          <mc:AlternateContent>
+            <mc:Choice Requires="w16se"/>
+            <mc:Fallback>
+              <w:rFonts w:ascii="Segoe UI Emoji" w:eastAsia="Segoe UI Emoji" w:hAnsi="Segoe UI Emoji" w:cs="Segoe UI Emoji"/>
+            </mc:Fallback>
+          </mc:AlternateContent>
+          <w:lang w:val="en-US"/>
+        </w:rPr>
+        <mc:AlternateContent>
+          <mc:Choice Requires="w16se">
+            <w16se:symEx w16se:font="Segoe UI Emoji" w16se:char="1F63D"/>
+          </mc:Choice>
+          <mc:Fallback>
+            <w:t>😽</w:t>
+          </mc:Fallback>
+        </mc:AlternateContent>
+      </w:r>
+      <w:r>
+        <w:rPr>
+          <mc:AlternateContent>
+            <mc:Choice Requires="w16se"/>
+            <mc:Fallback>
+              <w:rFonts w:ascii="Segoe UI Emoji" w:eastAsia="Segoe UI Emoji" w:hAnsi="Segoe UI Emoji" w:cs="Segoe UI Emoji"/>
+            </mc:Fallback>
+          </mc:AlternateContent>
+          <w:lang w:val="en-US"/>
+        </w:rPr>
+        <mc:AlternateContent>
+          <mc:Choice Requires="w16se">
+            <w16se:symEx w16se:font="Segoe UI Emoji" w16se:char="1F63D"/>
+          </mc:Choice>
+          <mc:Fallback>
+            <w:t>😽</w:t>
+          </mc:Fallback>
+        </mc:AlternateContent>
+      </w:r>
+      <w:r>
+        <w:rPr>
+          <mc:AlternateContent>
+            <mc:Choice Requires="w16se"/>
+            <mc:Fallback>
+              <w:rFonts w:ascii="Segoe UI Emoji" w:eastAsia="Segoe UI Emoji" w:hAnsi="Segoe UI Emoji" w:cs="Segoe UI Emoji"/>
+            </mc:Fallback>
+          </mc:AlternateContent>
+          <w:lang w:val="en-US"/>
+        </w:rPr>
+        <mc:AlternateContent>
+          <mc:Choice Requires="w16se">
+            <w16se:symEx w16se:font="Segoe UI Emoji" w16se:char="1F63D"/>
+          </mc:Choice>
+          <mc:Fallback>
+            <w:t>😽</w:t>
+          </mc:Fallback>
+        </mc:AlternateContent>
+      </w:r>
+      <w:r>
+        <w:rPr>
+          <mc:AlternateContent>
+            <mc:Choice Requires="w16se"/>
+            <mc:Fallback>
+              <w:rFonts w:ascii="Segoe UI Emoji" w:eastAsia="Segoe UI Emoji" w:hAnsi="Segoe UI Emoji" w:cs="Segoe UI Emoji"/>
+            </mc:Fallback>
+          </mc:AlternateContent>
+          <w:lang w:val="en-US"/>
+        </w:rPr>
+        <mc:AlternateContent>
+          <mc:Choice Requires="w16se">
+            <w16se:symEx w16se:font="Segoe UI Emoji" w16se:char="1F63D"/>
+          </mc:Choice>
+          <mc:Fallback>
+            <w:t>😽</w:t>
+          </mc:Fallback>
+        </mc:AlternateContent>
+      </w:r>
+      <w:r>
+        <w:rPr>
+          <mc:AlternateContent>
+            <mc:Choice Requires="w16se"/>
+            <mc:Fallback>
+              <w:rFonts w:ascii="Segoe UI Emoji" w:eastAsia="Segoe UI Emoji" w:hAnsi="Segoe UI Emoji" w:cs="Segoe UI Emoji"/>
+            </mc:Fallback>
+          </mc:AlternateContent>
+          <w:lang w:val="en-US"/>
+        </w:rPr>
+        <mc:AlternateContent>
+          <mc:Choice Requires="w16se">
+            <w16se:symEx w16se:font="Segoe UI Emoji" w16se:char="1F63D"/>
+          </mc:Choice>
+          <mc:Fallback>
+            <w:t>😽</w:t>
+          </mc:Fallback>
+        </mc:AlternateContent>
+      </w:r>
+      <w:r>
+        <w:rPr>
+          <mc:AlternateContent>
+            <mc:Choice Requires="w16se"/>
+            <mc:Fallback>
+              <w:rFonts w:ascii="Segoe UI Emoji" w:eastAsia="Segoe UI Emoji" w:hAnsi="Segoe UI Emoji" w:cs="Segoe UI Emoji"/>
+            </mc:Fallback>
+          </mc:AlternateContent>
+          <w:lang w:val="en-US"/>
+        </w:rPr>
+        <mc:AlternateContent>
+          <mc:Choice Requires="w16se">
+            <w16se:symEx w16se:font="Segoe UI Emoji" w16se:char="1F63D"/>
+          </mc:Choice>
+          <mc:Fallback>
+            <w:t>😽</w:t>
+          </mc:Fallback>
+        </mc:AlternateContent>
+      </w:r>
+      <w:r>
+        <w:rPr>
+          <mc:AlternateContent>
+            <mc:Choice Requires="w16se"/>
+            <mc:Fallback>
+              <w:rFonts w:ascii="Segoe UI Emoji" w:eastAsia="Segoe UI Emoji" w:hAnsi="Segoe UI Emoji" w:cs="Segoe UI Emoji"/>
+            </mc:Fallback>
+          </mc:AlternateContent>
+          <w:lang w:val="en-US"/>
+        </w:rPr>
+        <mc:AlternateContent>
+          <mc:Choice Requires="w16se">
+            <w16se:symEx w16se:font="Segoe UI Emoji" w16se:char="1F63D"/>
+          </mc:Choice>
+          <mc:Fallback>
+            <w:t>😽</w:t>
+          </mc:Fallback>
+        </mc:AlternateContent>
+      </w:r>
+      <w:r>
+        <w:rPr>
+          <mc:AlternateContent>
+            <mc:Choice Requires="w16se"/>
+            <mc:Fallback>
+              <w:rFonts w:ascii="Segoe UI Emoji" w:eastAsia="Segoe UI Emoji" w:hAnsi="Segoe UI Emoji" w:cs="Segoe UI Emoji"/>
+            </mc:Fallback>
+          </mc:AlternateContent>
+          <w:lang w:val="en-US"/>
+        </w:rPr>
+        <mc:AlternateContent>
+          <mc:Choice Requires="w16se">
+            <w16se:symEx w16se:font="Segoe UI Emoji" w16se:char="1F63D"/>
+          </mc:Choice>
+          <mc:Fallback>
+            <w:t>😽</w:t>
+          </mc:Fallback>
+        </mc:AlternateContent>
+      </w:r>
+      <w:r>
+        <w:rPr>
+          <mc:AlternateContent>
+            <mc:Choice Requires="w16se"/>
+            <mc:Fallback>
+              <w:rFonts w:ascii="Segoe UI Emoji" w:eastAsia="Segoe UI Emoji" w:hAnsi="Segoe UI Emoji" w:cs="Segoe UI Emoji"/>
+            </mc:Fallback>
+          </mc:AlternateContent>
+          <w:lang w:val="en-US"/>
+        </w:rPr>
+        <mc:AlternateContent>
+          <mc:Choice Requires="w16se">
+            <w16se:symEx w16se:font="Segoe UI Emoji" w16se:char="1F63D"/>
+          </mc:Choice>
+          <mc:Fallback>
+            <w:t>😽</w:t>
+          </mc:Fallback>
+        </mc:AlternateContent>
+      </w:r>
+      <w:r>
+        <w:rPr>
+          <mc:AlternateContent>
+            <mc:Choice Requires="w16se"/>
+            <mc:Fallback>
+              <w:rFonts w:ascii="Segoe UI Emoji" w:eastAsia="Segoe UI Emoji" w:hAnsi="Segoe UI Emoji" w:cs="Segoe UI Emoji"/>
+            </mc:Fallback>
+          </mc:AlternateContent>
+          <w:lang w:val="en-US"/>
+        </w:rPr>
+        <mc:AlternateContent>
+          <mc:Choice Requires="w16se">
+            <w16se:symEx w16se:font="Segoe UI Emoji" w16se:char="1F63D"/>
+          </mc:Choice>
+          <mc:Fallback>
+            <w:t>😽</w:t>
+          </mc:Fallback>
+        </mc:AlternateContent>
+      </w:r>
+      <w:r>
+        <w:rPr>
+          <mc:AlternateContent>
+            <mc:Choice Requires="w16se"/>
+            <mc:Fallback>
+              <w:rFonts w:ascii="Segoe UI Emoji" w:eastAsia="Segoe UI Emoji" w:hAnsi="Segoe UI Emoji" w:cs="Segoe UI Emoji"/>
+            </mc:Fallback>
+          </mc:AlternateContent>
+          <w:lang w:val="en-US"/>
+        </w:rPr>
+        <mc:AlternateContent>
+          <mc:Choice Requires="w16se">
+            <w16se:symEx w16se:font="Segoe UI Emoji" w16se:char="1F63D"/>
+          </mc:Choice>
+          <mc:Fallback>
+            <w:t>😽</w:t>
+          </mc:Fallback>
+        </mc:AlternateContent>
+      </w:r>
+      <w:r>
+        <w:rPr>
+          <mc:AlternateContent>
+            <mc:Choice Requires="w16se"/>
+            <mc:Fallback>
+              <w:rFonts w:ascii="Segoe UI Emoji" w:eastAsia="Segoe UI Emoji" w:hAnsi="Segoe UI Emoji" w:cs="Segoe UI Emoji"/>
+            </mc:Fallback>
+          </mc:AlternateContent>
+          <w:lang w:val="en-US"/>
+        </w:rPr>
+        <mc:AlternateContent>
+          <mc:Choice Requires="w16se">
+            <w16se:symEx w16se:font="Segoe UI Emoji" w16se:char="1F63D"/>
+          </mc:Choice>
+          <mc:Fallback>
+            <w:t>😽</w:t>
+          </mc:Fallback>
+        </mc:AlternateContent>
+      </w:r>
+      <w:r>
+        <w:rPr>
+          <mc:AlternateContent>
+            <mc:Choice Requires="w16se"/>
+            <mc:Fallback>
+              <w:rFonts w:ascii="Segoe UI Emoji" w:eastAsia="Segoe UI Emoji" w:hAnsi="Segoe UI Emoji" w:cs="Segoe UI Emoji"/>
+            </mc:Fallback>
+          </mc:AlternateContent>
+          <w:lang w:val="en-US"/>
+        </w:rPr>
+        <mc:AlternateContent>
+          <mc:Choice Requires="w16se">
+            <w16se:symEx w16se:font="Segoe UI Emoji" w16se:char="1F63D"/>
+          </mc:Choice>
+          <mc:Fallback>
+            <w:t>😽</w:t>
+          </mc:Fallback>
+        </mc:AlternateContent>
+      </w:r>
+      <w:r>
+        <w:rPr>
+          <mc:AlternateContent>
+            <mc:Choice Requires="w16se"/>
+            <mc:Fallback>
+              <w:rFonts w:ascii="Segoe UI Emoji" w:eastAsia="Segoe UI Emoji" w:hAnsi="Segoe UI Emoji" w:cs="Segoe UI Emoji"/>
+            </mc:Fallback>
+          </mc:AlternateContent>
+          <w:lang w:val="en-US"/>
+        </w:rPr>
+        <mc:AlternateContent>
+          <mc:Choice Requires="w16se">
+            <w16se:symEx w16se:font="Segoe UI Emoji" w16se:char="1F63D"/>
+          </mc:Choice>
+          <mc:Fallback>
+            <w:t>😽</w:t>
+          </mc:Fallback>
+        </mc:AlternateContent>
+      </w:r>
+      <w:r>
+        <w:rPr>
+          <mc:AlternateContent>
+            <mc:Choice Requires="w16se"/>
+            <mc:Fallback>
+              <w:rFonts w:ascii="Segoe UI Emoji" w:eastAsia="Segoe UI Emoji" w:hAnsi="Segoe UI Emoji" w:cs="Segoe UI Emoji"/>
+            </mc:Fallback>
+          </mc:AlternateContent>
+          <w:lang w:val="en-US"/>
+        </w:rPr>
+        <mc:AlternateContent>
+          <mc:Choice Requires="w16se">
+            <w16se:symEx w16se:font="Segoe UI Emoji" w16se:char="1F63D"/>
+          </mc:Choice>
+          <mc:Fallback>
+            <w:t>😽</w:t>
+          </mc:Fallback>
+        </mc:AlternateContent>
+      </w:r>
+      <w:r>
+        <w:rPr>
+          <mc:AlternateContent>
+            <mc:Choice Requires="w16se"/>
+            <mc:Fallback>
+              <w:rFonts w:ascii="Segoe UI Emoji" w:eastAsia="Segoe UI Emoji" w:hAnsi="Segoe UI Emoji" w:cs="Segoe UI Emoji"/>
+            </mc:Fallback>
+          </mc:AlternateContent>
+          <w:lang w:val="en-US"/>
+        </w:rPr>
+        <mc:AlternateContent>
+          <mc:Choice Requires="w16se">
+            <w16se:symEx w16se:font="Segoe UI Emoji" w16se:char="1F63D"/>
+          </mc:Choice>
+          <mc:Fallback>
+            <w:t>😽</w:t>
+          </mc:Fallback>
+        </mc:AlternateContent>
+      </w:r>
+      <w:r>
+        <w:rPr>
+          <mc:AlternateContent>
+            <mc:Choice Requires="w16se"/>
+            <mc:Fallback>
+              <w:rFonts w:ascii="Segoe UI Emoji" w:eastAsia="Segoe UI Emoji" w:hAnsi="Segoe UI Emoji" w:cs="Segoe UI Emoji"/>
+            </mc:Fallback>
+          </mc:AlternateContent>
+          <w:lang w:val="en-US"/>
+        </w:rPr>
+        <mc:AlternateContent>
+          <mc:Choice Requires="w16se">
+            <w16se:symEx w16se:font="Segoe UI Emoji" w16se:char="1F63D"/>
+          </mc:Choice>
+          <mc:Fallback>
+            <w:t>😽</w:t>
+          </mc:Fallback>
+        </mc:AlternateContent>
+      </w:r>
+      <w:r>
+        <w:rPr>
+          <mc:AlternateContent>
+            <mc:Choice Requires="w16se"/>
+            <mc:Fallback>
+              <w:rFonts w:ascii="Segoe UI Emoji" w:eastAsia="Segoe UI Emoji" w:hAnsi="Segoe UI Emoji" w:cs="Segoe UI Emoji"/>
+            </mc:Fallback>
+          </mc:AlternateContent>
+          <w:lang w:val="en-US"/>
+        </w:rPr>
+        <mc:AlternateContent>
+          <mc:Choice Requires="w16se">
+            <w16se:symEx w16se:font="Segoe UI Emoji" w16se:char="1F63D"/>
+          </mc:Choice>
+          <mc:Fallback>
+            <w:t>😽</w:t>
+          </mc:Fallback>
+        </mc:AlternateContent>
+      </w:r>
+      <w:r>
+        <w:rPr>
+          <mc:AlternateContent>
+            <mc:Choice Requires="w16se"/>
+            <mc:Fallback>
+              <w:rFonts w:ascii="Segoe UI Emoji" w:eastAsia="Segoe UI Emoji" w:hAnsi="Segoe UI Emoji" w:cs="Segoe UI Emoji"/>
+            </mc:Fallback>
+          </mc:AlternateContent>
+          <w:lang w:val="en-US"/>
+        </w:rPr>
+        <mc:AlternateContent>
+          <mc:Choice Requires="w16se">
+            <w16se:symEx w16se:font="Segoe UI Emoji" w16se:char="1F63D"/>
+          </mc:Choice>
+          <mc:Fallback>
+            <w:t>😽</w:t>
+          </mc:Fallback>
+        </mc:AlternateContent>
+      </w:r>
+      <w:r>
+        <w:rPr>
+          <mc:AlternateContent>
+            <mc:Choice Requires="w16se"/>
+            <mc:Fallback>
+              <w:rFonts w:ascii="Segoe UI Emoji" w:eastAsia="Segoe UI Emoji" w:hAnsi="Segoe UI Emoji" w:cs="Segoe UI Emoji"/>
+            </mc:Fallback>
+          </mc:AlternateContent>
+          <w:lang w:val="en-US"/>
+        </w:rPr>
+        <mc:AlternateContent>
+          <mc:Choice Requires="w16se">
+            <w16se:symEx w16se:font="Segoe UI Emoji" w16se:char="1F63D"/>
+          </mc:Choice>
+          <mc:Fallback>
+            <w:t>😽</w:t>
+          </mc:Fallback>
+        </mc:AlternateContent>
+      </w:r>
+    </w:p>
+    <w:p>
+      <w:pPr>
+        <w:spacing w:line="240" w:lineRule="auto"/>
+        <w:rPr>
+          <w:rFonts w:ascii="Arial" w:hAnsi="Arial" w:cs="Arial"/>
+          <w:sz w:val="22"/>
+          <w:szCs w:val="22"/>
+          <w:lang w:val="en-US"/>
+        </w:rPr>
+      </w:pPr>
+      <w:r>
+        <w:rPr>
+          <w:rFonts w:ascii="Arial" w:hAnsi="Arial" w:cs="Arial"/>
+          <w:sz w:val="22"/>
+          <w:szCs w:val="22"/>
+          <w:lang w:val="en-US"/>
+        </w:rPr>
+        <w:t>PS C:\Users\Artur\vscode\uni&gt; curl.exe -v -X GET http://localhost:8000/200 -o 200.jpg</w:t>
+      </w:r>
+    </w:p>
+    <w:p>
+      <w:pPr>
+        <w:spacing w:line="240" w:lineRule="auto"/>
+        <w:rPr>
+          <w:rFonts w:ascii="Arial" w:hAnsi="Arial" w:cs="Arial"/>
+          <w:sz w:val="22"/>
+          <w:szCs w:val="22"/>
+          <w:lang w:val="en-US"/>
+        </w:rPr>
+      </w:pPr>
+      <w:r>
+        <w:rPr>
+          <w:rFonts w:ascii="Arial" w:hAnsi="Arial" w:cs="Arial"/>
+          <w:sz w:val="22"/>
+          <w:szCs w:val="22"/>
+          <w:lang w:val="en-US"/>
+        </w:rPr>
+        <w:t>Note: Unnecessary use of -X or --request, GET is already inferred.</w:t>
+      </w:r>
+    </w:p>
+    <w:p>
+      <w:pPr>
+        <w:spacing w:line="240" w:lineRule="auto"/>
+        <w:rPr>
+          <w:rFonts w:ascii="Arial" w:hAnsi="Arial" w:cs="Arial"/>
+          <w:sz w:val="22"/>
+          <w:szCs w:val="22"/>
+          <w:lang w:val="en-US"/>
+        </w:rPr>
+      </w:pPr>
+      <w:r>
+        <w:rPr>
+          <w:rFonts w:ascii="Arial" w:hAnsi="Arial" w:cs="Arial"/>
+          <w:sz w:val="22"/>
+          <w:szCs w:val="22"/>
+          <w:lang w:val="en-US"/>
+        </w:rPr>
+        <w:t>* Host localhost:8000 was resolved.</w:t>
+      </w:r>
+    </w:p>
+    <w:p>
+      <w:pPr>
+        <w:spacing w:line="240" w:lineRule="auto"/>
+        <w:rPr>
+          <w:rFonts w:ascii="Arial" w:hAnsi="Arial" w:cs="Arial"/>
+          <w:sz w:val="22"/>
+          <w:szCs w:val="22"/>
+          <w:lang w:val="en-US"/>
+        </w:rPr>
+      </w:pPr>
+      <w:r>
+        <w:rPr>
+          <w:rFonts w:ascii="Arial" w:hAnsi="Arial" w:cs="Arial"/>
+          <w:sz w:val="22"/>
+          <w:szCs w:val="22"/>
+          <w:lang w:val="en-US"/>
+        </w:rPr>
+        <w:t>* IPv6: ::1</w:t>
+      </w:r>
+    </w:p>
+    <w:p>
+      <w:pPr>
+        <w:spacing w:line="240" w:lineRule="auto"/>
+        <w:rPr>
+          <w:rFonts w:ascii="Arial" w:hAnsi="Arial" w:cs="Arial"/>
+          <w:sz w:val="22"/>
+          <w:szCs w:val="22"/>
+          <w:lang w:val="en-US"/>
+        </w:rPr>
+      </w:pPr>
+      <w:r>
+        <w:rPr>
+          <w:rFonts w:ascii="Arial" w:hAnsi="Arial" w:cs="Arial"/>
+          <w:sz w:val="22"/>
+          <w:szCs w:val="22"/>
+          <w:lang w:val="en-US"/>
+        </w:rPr>
+        <w:t>* IPv4: 127.0.0.1</w:t>
+      </w:r>
+    </w:p>
+    <w:p>
+      <w:pPr>
+        <w:spacing w:line="240" w:lineRule="auto"/>
+        <w:rPr>
+          <w:rFonts w:ascii="Arial" w:hAnsi="Arial" w:cs="Arial"/>
+          <w:sz w:val="22"/>
+          <w:szCs w:val="22"/>
+          <w:lang w:val="en-US"/>
+        </w:rPr>
+      </w:pPr>
+      <w:r>
+        <w:rPr>
+          <w:rFonts w:ascii="Arial" w:hAnsi="Arial" w:cs="Arial"/>
+          <w:sz w:val="22"/>
+          <w:szCs w:val="22"/>
+          <w:lang w:val="en-US"/>
+        </w:rPr>
+        <w:t xml:space="preserve">  % Total    % Received % Xferd  Average Speed   Time    Time     Time  Current</w:t>
+      </w:r>
+    </w:p>
+    <w:p>
+      <w:pPr>
+        <w:spacing w:line="240" w:lineRule="auto"/>
+        <w:rPr>
+          <w:rFonts w:ascii="Arial" w:hAnsi="Arial" w:cs="Arial"/>
+          <w:sz w:val="22"/>
+          <w:szCs w:val="22"/>
+          <w:lang w:val="en-US"/>
+        </w:rPr>
+      </w:pPr>
+      <w:r>
+        <w:rPr>
+          <w:rFonts w:ascii="Arial" w:hAnsi="Arial" w:cs="Arial"/>
+          <w:sz w:val="22"/>
+          <w:szCs w:val="22"/>
+          <w:lang w:val="en-US"/>
+        </w:rPr>
+        <w:t xml:space="preserve">                                 Dload  Upload   Total   Spent    Left  Speed</w:t>
+      </w:r>
+    </w:p>
+    <w:p>
+      <w:pPr>
+        <w:spacing w:line="240" w:lineRule="auto"/>
+        <w:rPr>
+          <w:rFonts w:ascii="Arial" w:hAnsi="Arial" w:cs="Arial"/>
+          <w:sz w:val="22"/>
+          <w:szCs w:val="22"/>
+          <w:lang w:val="en-US"/>
+        </w:rPr>
+      </w:pPr>
+      <w:r>
+        <w:rPr>
+          <w:rFonts w:ascii="Arial" w:hAnsi="Arial" w:cs="Arial"/>
+          <w:sz w:val="22"/>
+          <w:szCs w:val="22"/>
+          <w:lang w:val="en-US"/>
+        </w:rPr>
+        <w:t xml:space="preserve">  0     0    0     0    0     0      0      0 --:--:-- --:--:-- --:--:--     0*   Trying [::1]:8000...</w:t>
+      </w:r>
+    </w:p>
+    <w:p>
+      <w:pPr>
+        <w:spacing w:line="240" w:lineRule="auto"/>
+        <w:rPr>
+          <w:rFonts w:ascii="Arial" w:hAnsi="Arial" w:cs="Arial"/>
+          <w:sz w:val="22"/>
+          <w:szCs w:val="22"/>
+          <w:lang w:val="en-US"/>
+        </w:rPr>
+      </w:pPr>
+      <w:r>
+        <w:rPr>
+          <w:rFonts w:ascii="Arial" w:hAnsi="Arial" w:cs="Arial"/>
+          <w:sz w:val="22"/>
+          <w:szCs w:val="22"/>
+          <w:lang w:val="en-US"/>
+        </w:rPr>
+        <w:t>* Connected to localhost (::1) port 8000</w:t>
+      </w:r>
+    </w:p>
+    <w:p>
+      <w:pPr>
+        <w:spacing w:line="240" w:lineRule="auto"/>
+        <w:rPr>
+          <w:rFonts w:ascii="Arial" w:hAnsi="Arial" w:cs="Arial"/>
+          <w:sz w:val="22"/>
+          <w:szCs w:val="22"/>
+          <w:lang w:val="en-US"/>
+        </w:rPr>
+      </w:pPr>
+      <w:r>
+        <w:rPr>
+          <w:rFonts w:ascii="Arial" w:hAnsi="Arial" w:cs="Arial"/>
+          <w:sz w:val="22"/>
+          <w:szCs w:val="22"/>
+          <w:lang w:val="en-US"/>
+        </w:rPr>
+        <w:t>* using HTTP/1.x</w:t>
+      </w:r>
+    </w:p>
+    <w:p>
+      <w:pPr>
+        <w:spacing w:line="240" w:lineRule="auto"/>
+        <w:rPr>
+          <w:rFonts w:ascii="Arial" w:hAnsi="Arial" w:cs="Arial"/>
+          <w:sz w:val="22"/>
+          <w:szCs w:val="22"/>
+          <w:lang w:val="en-US"/>
+        </w:rPr>
+      </w:pPr>
+      <w:r>
+        <w:rPr>
+          <w:rFonts w:ascii="Arial" w:hAnsi="Arial" w:cs="Arial"/>
+          <w:sz w:val="22"/>
+          <w:szCs w:val="22"/>
+          <w:lang w:val="en-US"/>
+        </w:rPr>
+        <w:t>&gt; GET /200 HTTP/1.1</w:t>
+      </w:r>
+    </w:p>
+    <w:p>
+      <w:pPr>
+        <w:spacing w:line="240" w:lineRule="auto"/>
+        <w:rPr>
+          <w:rFonts w:ascii="Arial" w:hAnsi="Arial" w:cs="Arial"/>
+          <w:sz w:val="22"/>
+          <w:szCs w:val="22"/>
+          <w:lang w:val="en-US"/>
+        </w:rPr>
+      </w:pPr>
+      <w:r>
+        <w:rPr>
+          <w:rFonts w:ascii="Arial" w:hAnsi="Arial" w:cs="Arial"/>
+          <w:sz w:val="22"/>
+          <w:szCs w:val="22"/>
+          <w:lang w:val="en-US"/>
+        </w:rPr>
+        <w:t>&gt; Host: localhost:8000</w:t>
+      </w:r>
+    </w:p>
+    <w:p>
+      <w:pPr>
+        <w:spacing w:line="240" w:lineRule="auto"/>
+        <w:rPr>
+          <w:rFonts w:ascii="Arial" w:hAnsi="Arial" w:cs="Arial"/>
+          <w:sz w:val="22"/>
+          <w:szCs w:val="22"/>
+          <w:lang w:val="en-US"/>
+        </w:rPr>
+      </w:pPr>
+      <w:r>
+        <w:rPr>
+          <w:rFonts w:ascii="Arial" w:hAnsi="Arial" w:cs="Arial"/>
+          <w:sz w:val="22"/>
+          <w:szCs w:val="22"/>
+          <w:lang w:val="en-US"/>
+        </w:rPr>
+        <w:t>&gt; User-Agent: curl/8.13.0</w:t>
+      </w:r>
+    </w:p>
+    <w:p>
+      <w:pPr>
+        <w:spacing w:line="240" w:lineRule="auto"/>
+        <w:rPr>
+          <w:rFonts w:ascii="Arial" w:hAnsi="Arial" w:cs="Arial"/>
+          <w:sz w:val="22"/>
+          <w:szCs w:val="22"/>
+          <w:lang w:val="en-US"/>
+        </w:rPr>
+      </w:pPr>
+      <w:r>
+        <w:rPr>
+          <w:rFonts w:ascii="Arial" w:hAnsi="Arial" w:cs="Arial"/>
+          <w:sz w:val="22"/>
+          <w:szCs w:val="22"/>
+          <w:lang w:val="en-US"/>
+        </w:rPr>
+        <w:t>&gt; Accept: */*</w:t>
+      </w:r>
+    </w:p>
+    <w:p>
+      <w:pPr>
+        <w:spacing w:line="240" w:lineRule="auto"/>
+        <w:rPr>
+          <w:rFonts w:ascii="Arial" w:hAnsi="Arial" w:cs="Arial"/>
+          <w:sz w:val="22"/>
+          <w:szCs w:val="22"/>
+          <w:lang w:val="en-US"/>
+        </w:rPr>
+      </w:pPr>
+      <w:r>
+        <w:rPr>
+          <w:rFonts w:ascii="Arial" w:hAnsi="Arial" w:cs="Arial"/>
+          <w:sz w:val="22"/>
+          <w:szCs w:val="22"/>
+          <w:lang w:val="en-US"/>
+        </w:rPr>
+        <w:t xml:space="preserve">&gt; </w:t>
+      </w:r>
+    </w:p>
+    <w:p>
+      <w:pPr>
+        <w:spacing w:line="240" w:lineRule="auto"/>
+        <w:rPr>
+          <w:rFonts w:ascii="Arial" w:hAnsi="Arial" w:cs="Arial"/>
+          <w:sz w:val="22"/>
+          <w:szCs w:val="22"/>
+          <w:lang w:val="en-US"/>
+        </w:rPr>
+      </w:pPr>
+      <w:r>
+        <w:rPr>
+          <w:rFonts w:ascii="Arial" w:hAnsi="Arial" w:cs="Arial"/>
+          <w:sz w:val="22"/>
+          <w:szCs w:val="22"/>
+          <w:lang w:val="en-US"/>
+        </w:rPr>
+        <w:lastRenderedPageBreak/>
+        <w:t>&lt; HTTP/1.1 200 OK</w:t>
+      </w:r>
+    </w:p>
+    <w:p>
+      <w:pPr>
+        <w:spacing w:line="240" w:lineRule="auto"/>
+        <w:rPr>
+          <w:rFonts w:ascii="Arial" w:hAnsi="Arial" w:cs="Arial"/>
+          <w:sz w:val="22"/>
+          <w:szCs w:val="22"/>
+          <w:lang w:val="en-US"/>
+        </w:rPr>
+      </w:pPr>
+      <w:r>
+        <w:rPr>
+          <w:rFonts w:ascii="Arial" w:hAnsi="Arial" w:cs="Arial"/>
+          <w:sz w:val="22"/>
+          <w:szCs w:val="22"/>
+          <w:lang w:val="en-US"/>
+        </w:rPr>
+        <w:t>&lt; Content-Type: image/jpeg</w:t>
+      </w:r>
+    </w:p>
+    <w:p>
+      <w:pPr>
+        <w:spacing w:line="240" w:lineRule="auto"/>
+        <w:rPr>
+          <w:rFonts w:ascii="Arial" w:hAnsi="Arial" w:cs="Arial"/>
+          <w:sz w:val="22"/>
+          <w:szCs w:val="22"/>
+          <w:lang w:val="en-US"/>
+        </w:rPr>
+      </w:pPr>
+      <w:r>
+        <w:rPr>
+          <w:rFonts w:ascii="Arial" w:hAnsi="Arial" w:cs="Arial"/>
+          <w:sz w:val="22"/>
+          <w:szCs w:val="22"/>
+          <w:lang w:val="en-US"/>
+        </w:rPr>
+        <w:t>&lt; Date: Mon, 23 Feb 2026 05:52:08 GMT</w:t>
+      </w:r>
+    </w:p>
+    <w:p>
+      <w:pPr>
+        <w:spacing w:line="240" w:lineRule="auto"/>
+        <w:rPr>
+          <w:rFonts w:ascii="Arial" w:hAnsi="Arial" w:cs="Arial"/>
+          <w:sz w:val="22"/>
+          <w:szCs w:val="22"/>
+          <w:lang w:val="en-US"/>
+        </w:rPr>
+      </w:pPr>
+      <w:r>
+        <w:rPr>
+          <w:rFonts w:ascii="Arial" w:hAnsi="Arial" w:cs="Arial"/>
+          <w:sz w:val="22"/>
+          <w:szCs w:val="22"/>
+          <w:lang w:val="en-US"/>
+        </w:rPr>
+        <w:t>&lt; Connection: keep-alive</w:t>
+      </w:r>
+    </w:p>
+    <w:p>
+      <w:pPr>
+        <w:spacing w:line="240" w:lineRule="auto"/>
+        <w:rPr>
+          <w:rFonts w:ascii="Arial" w:hAnsi="Arial" w:cs="Arial"/>
+          <w:sz w:val="22"/>
+          <w:szCs w:val="22"/>
+          <w:lang w:val="en-US"/>
+        </w:rPr>
+      </w:pPr>
+      <w:r>
+        <w:rPr>
+          <w:rFonts w:ascii="Arial" w:hAnsi="Arial" w:cs="Arial"/>
+          <w:sz w:val="22"/>
+          <w:szCs w:val="22"/>
+          <w:lang w:val="en-US"/>
+        </w:rPr>
+        <w:t>&lt; Keep-Alive: timeout=5</w:t>
+      </w:r>
+    </w:p>
+    <w:p>
+      <w:pPr>
+        <w:spacing w:line="240" w:lineRule="auto"/>
+        <w:rPr>
+          <w:rFonts w:ascii="Arial" w:hAnsi="Arial" w:cs="Arial"/>
+          <w:sz w:val="22"/>
+          <w:szCs w:val="22"/>
+          <w:lang w:val="en-US"/>
+        </w:rPr>
+      </w:pPr>
+      <w:r>
+        <w:rPr>
+          <w:rFonts w:ascii="Arial" w:hAnsi="Arial" w:cs="Arial"/>
+          <w:sz w:val="22"/>
+          <w:szCs w:val="22"/>
+          <w:lang w:val="en-US"/>
+        </w:rPr>
+        <w:t>&lt; Transfer-Encoding: chunked</w:t>
+      </w:r>
+    </w:p>
+    <w:p>
+      <w:pPr>
+        <w:spacing w:line="240" w:lineRule="auto"/>
+        <w:rPr>
+          <w:rFonts w:ascii="Arial" w:hAnsi="Arial" w:cs="Arial"/>
+          <w:sz w:val="22"/>
+          <w:szCs w:val="22"/>
+          <w:lang w:val="en-US"/>
+        </w:rPr>
+      </w:pPr>
+      <w:r>
+        <w:rPr>
+          <w:rFonts w:ascii="Arial" w:hAnsi="Arial" w:cs="Arial"/>
+          <w:sz w:val="22"/>
+          <w:szCs w:val="22"/>
+          <w:lang w:val="en-US"/>
+        </w:rPr>
+        <w:t xml:space="preserve">&lt; </w:t>
+      </w:r>
+    </w:p>
+    <w:p>
+      <w:pPr>
+        <w:spacing w:line="240" w:lineRule="auto"/>
+        <w:rPr>
+          <w:rFonts w:ascii="Arial" w:hAnsi="Arial" w:cs="Arial"/>
+          <w:sz w:val="22"/>
+          <w:szCs w:val="22"/>
+          <w:lang w:val="en-US"/>
+        </w:rPr>
+      </w:pPr>
+      <w:r>
+        <w:rPr>
+          <w:rFonts w:ascii="Arial" w:hAnsi="Arial" w:cs="Arial"/>
+          <w:sz w:val="22"/>
+          <w:szCs w:val="22"/>
+          <w:lang w:val="en-US"/>
+        </w:rPr>
+        <w:t>{ [31141 bytes data]</w:t>
+      </w:r>
+    </w:p>
+    <w:p>
+      <w:pPr>
+        <w:spacing w:line="240" w:lineRule="auto"/>
+        <w:rPr>
+          <w:rFonts w:ascii="Arial" w:hAnsi="Arial" w:cs="Arial"/>
+          <w:sz w:val="22"/>
+          <w:szCs w:val="22"/>
+          <w:lang w:val="en-US"/>
+        </w:rPr>
+      </w:pPr>
+      <w:r>
+        <w:rPr>
+          <w:rFonts w:ascii="Arial" w:hAnsi="Arial" w:cs="Arial"/>
+          <w:sz w:val="22"/>
+          <w:szCs w:val="22"/>
+          <w:lang w:val="en-US"/>
+        </w:rPr>
+        <w:t>100 31128    0 31128    0     0  1128k      0 --:--:-- --:--:-- --:--:-- 1215k</w:t>
+      </w:r>
+    </w:p>
+    <w:p>
+      <w:pPr>
+        <w:spacing w:line="240" w:lineRule="auto"/>
+        <w:rPr>
+          <w:rFonts w:ascii="Arial" w:hAnsi="Arial" w:cs="Arial"/>
+          <w:sz w:val="22"/>
+          <w:szCs w:val="22"/>
+          <w:lang w:val="en-US"/>
+        </w:rPr>
+      </w:pPr>
+      <w:r>
+        <w:rPr>
+          <w:rFonts w:ascii="Arial" w:hAnsi="Arial" w:cs="Arial"/>
+          <w:sz w:val="22"/>
+          <w:szCs w:val="22"/>
+          <w:lang w:val="en-US"/>
+        </w:rPr>
+        <w:t>* Connection #0 to host localhost left intact</w:t>
+      </w:r>
+    </w:p>
+    <w:p>
+      <w:pPr>
+        <w:spacing w:line="240" w:lineRule="auto"/>
+        <w:rPr>
+          <w:rFonts w:ascii="Arial" w:hAnsi="Arial" w:cs="Arial"/>
+          <w:sz w:val="22"/>
+          <w:szCs w:val="22"/>
+          <w:lang w:val="en-US"/>
+        </w:rPr>
+      </w:pPr>
+      <w:r>
+        <w:rPr>
+          <w:rFonts w:ascii="Arial" w:hAnsi="Arial" w:cs="Arial"/>
+          <w:sz w:val="22"/>
+          <w:szCs w:val="22"/>
+          <w:lang w:val="en-US"/>
+        </w:rPr>
+        <w:t>PS C:\Users\Artur\vscode\uni&gt; curl.exe -v -X GET http://localhost:8000/429 -o 429.jpg</w:t>
+      </w:r>
+    </w:p>
+    <w:p>
+      <w:pPr>
+        <w:spacing w:line="240" w:lineRule="auto"/>
+        <w:rPr>
+          <w:rFonts w:ascii="Arial" w:hAnsi="Arial" w:cs="Arial"/>
+          <w:sz w:val="22"/>
+          <w:szCs w:val="22"/>
+          <w:lang w:val="en-US"/>
+        </w:rPr>
+      </w:pPr>
+      <w:r>
+        <w:rPr>
+          <w:rFonts w:ascii="Arial" w:hAnsi="Arial" w:cs="Arial"/>
+          <w:sz w:val="22"/>
+          <w:szCs w:val="22"/>
+          <w:lang w:val="en-US"/>
+        </w:rPr>
+        <w:t>Note: Unnecessary use of -X or --request, GET is already inferred.</w:t>
+      </w:r>
+    </w:p>
+    <w:p>
+      <w:pPr>
+        <w:spacing w:line="240" w:lineRule="auto"/>
+        <w:rPr>
+          <w:rFonts w:ascii="Arial" w:hAnsi="Arial" w:cs="Arial"/>
+          <w:sz w:val="22"/>
+          <w:szCs w:val="22"/>
+          <w:lang w:val="en-US"/>
+        </w:rPr>
+      </w:pPr>
+      <w:r>
+        <w:rPr>
+          <w:rFonts w:ascii="Arial" w:hAnsi="Arial" w:cs="Arial"/>
+          <w:sz w:val="22"/>
+          <w:szCs w:val="22"/>
+          <w:lang w:val="en-US"/>
+        </w:rPr>
+        <w:t>* Host localhost:8000 was resolved.</w:t>
+      </w:r>
+    </w:p>
+    <w:p>
+      <w:pPr>
+        <w:spacing w:line="240" w:lineRule="auto"/>
+        <w:rPr>
+          <w:rFonts w:ascii="Arial" w:hAnsi="Arial" w:cs="Arial"/>
+          <w:sz w:val="22"/>
+          <w:szCs w:val="22"/>
+          <w:lang w:val="en-US"/>
+        </w:rPr>
+      </w:pPr>
+      <w:r>
+        <w:rPr>
+          <w:rFonts w:ascii="Arial" w:hAnsi="Arial" w:cs="Arial"/>
+          <w:sz w:val="22"/>
+          <w:szCs w:val="22"/>
+          <w:lang w:val="en-US"/>
+        </w:rPr>
+        <w:t>* IPv6: ::1</w:t>
+      </w:r>
+    </w:p>
+    <w:p>
+      <w:pPr>
+        <w:spacing w:line="240" w:lineRule="auto"/>
+        <w:rPr>
+          <w:rFonts w:ascii="Arial" w:hAnsi="Arial" w:cs="Arial"/>
+          <w:sz w:val="22"/>
+          <w:szCs w:val="22"/>
+          <w:lang w:val="en-US"/>
+        </w:rPr>
+      </w:pPr>
+      <w:r>
+        <w:rPr>
+          <w:rFonts w:ascii="Arial" w:hAnsi="Arial" w:cs="Arial"/>
+          <w:sz w:val="22"/>
+          <w:szCs w:val="22"/>
+          <w:lang w:val="en-US"/>
+        </w:rPr>
+        <w:t>* IPv4: 127.0.0.1</w:t>
+      </w:r>
+    </w:p>
+    <w:p>
+      <w:pPr>
+        <w:spacing w:line="240" w:lineRule="auto"/>
+        <w:rPr>
+          <w:rFonts w:ascii="Arial" w:hAnsi="Arial" w:cs="Arial"/>
+          <w:sz w:val="22"/>
+          <w:szCs w:val="22"/>
+          <w:lang w:val="en-US"/>
+        </w:rPr>
+      </w:pPr>
+      <w:r>
+        <w:rPr>
+          <w:rFonts w:ascii="Arial" w:hAnsi="Arial" w:cs="Arial"/>
+          <w:sz w:val="22"/>
+          <w:szCs w:val="22"/>
+          <w:lang w:val="en-US"/>
+        </w:rPr>
+        <w:t xml:space="preserve">  % Total    % Received % Xferd  Average Speed   Time    Time     Time  Current</w:t>
+      </w:r>
+    </w:p>
+    <w:p>
+      <w:pPr>
+        <w:spacing w:line="240" w:lineRule="auto"/>
+        <w:rPr>
+          <w:rFonts w:ascii="Arial" w:hAnsi="Arial" w:cs="Arial"/>
+          <w:sz w:val="22"/>
+          <w:szCs w:val="22"/>
+          <w:lang w:val="en-US"/>
+        </w:rPr>
+      </w:pPr>
+      <w:r>
+        <w:rPr>
+          <w:rFonts w:ascii="Arial" w:hAnsi="Arial" w:cs="Arial"/>
+          <w:sz w:val="22"/>
+          <w:szCs w:val="22"/>
+          <w:lang w:val="en-US"/>
+        </w:rPr>
+        <w:t xml:space="preserve">                                 Dload  Upload   Total   Spent    Left  Speed</w:t>
+      </w:r>
+    </w:p>
+    <w:p>
+      <w:pPr>
+        <w:spacing w:line="240" w:lineRule="auto"/>
+        <w:rPr>
+          <w:rFonts w:ascii="Arial" w:hAnsi="Arial" w:cs="Arial"/>
+          <w:sz w:val="22"/>
+          <w:szCs w:val="22"/>
+          <w:lang w:val="en-US"/>
+        </w:rPr>
+      </w:pPr>
+      <w:r>
+        <w:rPr>
+          <w:rFonts w:ascii="Arial" w:hAnsi="Arial" w:cs="Arial"/>
+          <w:sz w:val="22"/>
+          <w:szCs w:val="22"/>
+          <w:lang w:val="en-US"/>
+        </w:rPr>
+        <w:t xml:space="preserve">  0     0    0     0    0     0      0      0 --:--:-- --:--:-- --:--:--     0*   Trying [::1]:8000...</w:t>
+      </w:r>
+    </w:p>
+    <w:p>
+      <w:pPr>
+        <w:spacing w:line="240" w:lineRule="auto"/>
+        <w:rPr>
+          <w:rFonts w:ascii="Arial" w:hAnsi="Arial" w:cs="Arial"/>
+          <w:sz w:val="22"/>
+          <w:szCs w:val="22"/>
+          <w:lang w:val="en-US"/>
+        </w:rPr>
+      </w:pPr>
+      <w:r>
+        <w:rPr>
+          <w:rFonts w:ascii="Arial" w:hAnsi="Arial" w:cs="Arial"/>
+          <w:sz w:val="22"/>
+          <w:szCs w:val="22"/>
+          <w:lang w:val="en-US"/>
+        </w:rPr>
+        <w:t>* Connected to localhost (::1) port 8000</w:t>
+      </w:r>
+    </w:p>
+    <w:p>
+      <w:pPr>
+        <w:spacing w:line="240" w:lineRule="auto"/>
+        <w:rPr>
+          <w:rFonts w:ascii="Arial" w:hAnsi="Arial" w:cs="Arial"/>
+          <w:sz w:val="22"/>
+          <w:szCs w:val="22"/>
+          <w:lang w:val="en-US"/>
+        </w:rPr>
+      </w:pPr>
+      <w:r>
+        <w:rPr>
+          <w:rFonts w:ascii="Arial" w:hAnsi="Arial" w:cs="Arial"/>
+          <w:sz w:val="22"/>
+          <w:szCs w:val="22"/>
+          <w:lang w:val="en-US"/>
+        </w:rPr>
+        <w:t>* using HTTP/1.x</w:t>
+      </w:r>
+    </w:p>
+    <w:p>
+      <w:pPr>
+        <w:spacing w:line="240" w:lineRule="auto"/>
+        <w:rPr>
+          <w:rFonts w:ascii="Arial" w:hAnsi="Arial" w:cs="Arial"/>
+          <w:sz w:val="22"/>
+          <w:szCs w:val="22"/>
+          <w:lang w:val="en-US"/>
+        </w:rPr>
+      </w:pPr>
+      <w:r>
+        <w:rPr>
+          <w:rFonts w:ascii="Arial" w:hAnsi="Arial" w:cs="Arial"/>
+          <w:sz w:val="22"/>
+          <w:szCs w:val="22"/>
+          <w:lang w:val="en-US"/>
+        </w:rPr>
+        <w:t>&gt; GET /429 HTTP/1.1</w:t>
+      </w:r>
+    </w:p>
+    <w:p>
+      <w:pPr>
+        <w:spacing w:line="240" w:lineRule="auto"/>
+        <w:rPr>
+          <w:rFonts w:ascii="Arial" w:hAnsi="Arial" w:cs="Arial"/>
+          <w:sz w:val="22"/>
+          <w:szCs w:val="22"/>
+          <w:lang w:val="en-US"/>
+        </w:rPr>
+      </w:pPr>
+      <w:r>
+        <w:rPr>
+          <w:rFonts w:ascii="Arial" w:hAnsi="Arial" w:cs="Arial"/>
+          <w:sz w:val="22"/>
+          <w:szCs w:val="22"/>
+          <w:lang w:val="en-US"/>
+        </w:rPr>
+        <w:t>&gt; Host: localhost:8000</w:t>
+      </w:r>
+    </w:p>
+    <w:p>
+      <w:pPr>
+        <w:spacing w:line="240" w:lineRule="auto"/>
+        <w:rPr>
+          <w:rFonts w:ascii="Arial" w:hAnsi="Arial" w:cs="Arial"/>
+          <w:sz w:val="22"/>
+          <w:szCs w:val="22"/>
+          <w:lang w:val="en-US"/>
+        </w:rPr>
+      </w:pPr>
+      <w:r>
+        <w:rPr>
+          <w:rFonts w:ascii="Arial" w:hAnsi="Arial" w:cs="Arial"/>
+          <w:sz w:val="22"/>
+          <w:szCs w:val="22"/>
+          <w:lang w:val="en-US"/>
+        </w:rPr>
+        <w:t>&gt; User-Agent: curl/8.13.0</w:t>
+      </w:r>
+    </w:p>
+    <w:p>
+      <w:pPr>
+        <w:spacing w:line="240" w:lineRule="auto"/>
+        <w:rPr>
+          <w:rFonts w:ascii="Arial" w:hAnsi="Arial" w:cs="Arial"/>
+          <w:sz w:val="22"/>
+          <w:szCs w:val="22"/>
+          <w:lang w:val="en-US"/>
+        </w:rPr>
+      </w:pPr>
+      <w:r>
+        <w:rPr>
+          <w:rFonts w:ascii="Arial" w:hAnsi="Arial" w:cs="Arial"/>
+          <w:sz w:val="22"/>
+          <w:szCs w:val="22"/>
+          <w:lang w:val="en-US"/>
+        </w:rPr>
+        <w:t>&gt; Accept: */*</w:t>
+      </w:r>
+    </w:p>
+    <w:p>
+      <w:pPr>
+        <w:spacing w:line="240" w:lineRule="auto"/>
+        <w:rPr>
+          <w:rFonts w:ascii="Arial" w:hAnsi="Arial" w:cs="Arial"/>
+          <w:sz w:val="22"/>
+          <w:szCs w:val="22"/>
+          <w:lang w:val="en-US"/>
+        </w:rPr>
+      </w:pPr>
+      <w:r>
+        <w:rPr>
+          <w:rFonts w:ascii="Arial" w:hAnsi="Arial" w:cs="Arial"/>
+          <w:sz w:val="22"/>
+          <w:szCs w:val="22"/>
+          <w:lang w:val="en-US"/>
+        </w:rPr>
+        <w:t>&gt;</w:t>
+      </w:r>
+    </w:p>
+    <w:p>
+      <w:pPr>
+        <w:spacing w:line="240" w:lineRule="auto"/>
+        <w:rPr>
+          <w:rFonts w:ascii="Arial" w:hAnsi="Arial" w:cs="Arial"/>
+          <w:sz w:val="22"/>
+          <w:szCs w:val="22"/>
+          <w:lang w:val="en-US"/>
+        </w:rPr>
+      </w:pPr>
+      <w:r>
+        <w:rPr>
+          <w:rFonts w:ascii="Arial" w:hAnsi="Arial" w:cs="Arial"/>
+          <w:sz w:val="22"/>
+          <w:szCs w:val="22"/>
+          <w:lang w:val="en-US"/>
+        </w:rPr>
+        <w:t>&lt; HTTP/1.1 200 OK</w:t>
+      </w:r>
+    </w:p>
+    <w:p>
+      <w:pPr>
+        <w:spacing w:line="240" w:lineRule="auto"/>
+        <w:rPr>
+          <w:rFonts w:ascii="Arial" w:hAnsi="Arial" w:cs="Arial"/>
+          <w:sz w:val="22"/>
+          <w:szCs w:val="22"/>
+          <w:lang w:val="en-US"/>
+        </w:rPr>
+      </w:pPr>
+      <w:r>
+        <w:rPr>
+          <w:rFonts w:ascii="Arial" w:hAnsi="Arial" w:cs="Arial"/>
+          <w:sz w:val="22"/>
+          <w:szCs w:val="22"/>
+          <w:lang w:val="en-US"/>
+        </w:rPr>
+        <w:t>&lt; Content-Type: image/jpeg</w:t>
+      </w:r>
+    </w:p>
+    <w:p>
+      <w:pPr>
+        <w:spacing w:line="240" w:lineRule="auto"/>
+        <w:rPr>
+          <w:rFonts w:ascii="Arial" w:hAnsi="Arial" w:cs="Arial"/>
+          <w:sz w:val="22"/>
+          <w:szCs w:val="22"/>
+          <w:lang w:val="en-US"/>
+        </w:rPr>
+      </w:pPr>
+      <w:r>
+        <w:rPr>
+          <w:rFonts w:ascii="Arial" w:hAnsi="Arial" w:cs="Arial"/>
+          <w:sz w:val="22"/>
+          <w:szCs w:val="22"/>
+          <w:lang w:val="en-US"/>
+        </w:rPr>
+        <w:t>&lt; Date: Mon, 23 Feb 2026 05:52:08 GMT</w:t>
+      </w:r>
+    </w:p>
+    <w:p>
+      <w:pPr>
+        <w:spacing w:line="240" w:lineRule="auto"/>
+        <w:rPr>
+          <w:rFonts w:ascii="Arial" w:hAnsi="Arial" w:cs="Arial"/>
+          <w:sz w:val="22"/>
+          <w:szCs w:val="22"/>
+          <w:lang w:val="en-US"/>
+        </w:rPr>
+      </w:pPr>
+      <w:r>
+        <w:rPr>
+          <w:rFonts w:ascii="Arial" w:hAnsi="Arial" w:cs="Arial"/>
+          <w:sz w:val="22"/>
+          <w:szCs w:val="22"/>
+          <w:lang w:val="en-US"/>
+        </w:rPr>
+        <w:t>&lt; Connection: keep-alive</w:t>
+      </w:r>
+    </w:p>
+    <w:p>
+      <w:pPr>
+        <w:spacing w:line="240" w:lineRule="auto"/>
+        <w:rPr>
+          <w:rFonts w:ascii="Arial" w:hAnsi="Arial" w:cs="Arial"/>
+          <w:sz w:val="22"/>
+          <w:szCs w:val="22"/>
+          <w:lang w:val="en-US"/>
+        </w:rPr>
+      </w:pPr>
+      <w:r>
+        <w:rPr>
+          <w:rFonts w:ascii="Arial" w:hAnsi="Arial" w:cs="Arial"/>
+          <w:sz w:val="22"/>
+          <w:szCs w:val="22"/>
+          <w:lang w:val="en-US"/>
+        </w:rPr>
+        <w:t>&lt; Keep-Alive: timeout=5</w:t>
+      </w:r>
+    </w:p>
+    <w:p>
+      <w:pPr>
+        <w:spacing w:line="240" w:lineRule="auto"/>
+        <w:rPr>
+          <w:rFonts w:ascii="Arial" w:hAnsi="Arial" w:cs="Arial"/>
+          <w:sz w:val="22"/>
+          <w:szCs w:val="22"/>
+          <w:lang w:val="en-US"/>
+        </w:rPr>
+      </w:pPr>
+      <w:r>
+        <w:rPr>
+          <w:rFonts w:ascii="Arial" w:hAnsi="Arial" w:cs="Arial"/>
+          <w:sz w:val="22"/>
+          <w:szCs w:val="22"/>
+          <w:lang w:val="en-US"/>
+        </w:rPr>
+        <w:t>&lt; Transfer-Encoding: chunked</w:t>
+      </w:r>
+    </w:p>
+    <w:p>
+      <w:pPr>
+        <w:spacing w:line="240" w:lineRule="auto"/>
+        <w:rPr>
+          <w:rFonts w:ascii="Arial" w:hAnsi="Arial" w:cs="Arial"/>
+          <w:sz w:val="22"/>
+          <w:szCs w:val="22"/>
+          <w:lang w:val="en-US"/>
+        </w:rPr>
+      </w:pPr>
+      <w:r>
+        <w:rPr>
+          <w:rFonts w:ascii="Arial" w:hAnsi="Arial" w:cs="Arial"/>
+          <w:sz w:val="22"/>
+          <w:szCs w:val="22"/>
+          <w:lang w:val="en-US"/>
+        </w:rPr>
+        <w:t>&lt;</w:t>
+      </w:r>
+    </w:p>
+    <w:p>
+      <w:pPr>
+        <w:spacing w:line="240" w:lineRule="auto"/>
+        <w:rPr>
+          <w:rFonts w:ascii="Arial" w:hAnsi="Arial" w:cs="Arial"/>
+          <w:sz w:val="22"/>
+          <w:szCs w:val="22"/>
+          <w:lang w:val="en-US"/>
+        </w:rPr>
+      </w:pPr>
+      <w:r>
+        <w:rPr>
+          <w:rFonts w:ascii="Arial" w:hAnsi="Arial" w:cs="Arial"/>
+          <w:sz w:val="22"/>
+          <w:szCs w:val="22"/>
+          <w:lang w:val="en-US"/>
+        </w:rPr>
+        <w:t>{ [33717 bytes data]</w:t>
+      </w:r>
+    </w:p>
+    <w:p>
+      <w:pPr>
+        <w:spacing w:line="240" w:lineRule="auto"/>
+        <w:rPr>
+          <w:rFonts w:ascii="Arial" w:hAnsi="Arial" w:cs="Arial"/>
+          <w:sz w:val="22"/>
+          <w:szCs w:val="22"/>
+          <w:lang w:val="en-US"/>
+        </w:rPr>
+      </w:pPr>
+      <w:r>
+        <w:rPr>
+          <w:rFonts w:ascii="Arial" w:hAnsi="Arial" w:cs="Arial"/>
+          <w:sz w:val="22"/>
+          <w:szCs w:val="22"/>
+          <w:lang w:val="en-US"/>
+        </w:rPr>
+        <w:t>100 33704    0 33704    0     0  1035k      0 --:--:-- --:--:-- --:--:-- 1175k</w:t>
+      </w:r>
+    </w:p>
+    <w:p>
+      <w:pPr>
+        <w:spacing w:line="240" w:lineRule="auto"/>
+        <w:rPr>
+          <w:rFonts w:ascii="Arial" w:hAnsi="Arial" w:cs="Arial"/>
+          <w:sz w:val="22"/>
+          <w:szCs w:val="22"/>
+          <w:lang w:val="en-US"/>
+        </w:rPr>
+      </w:pPr>
+      <w:r>
+        <w:rPr>
+          <w:rFonts w:ascii="Arial" w:hAnsi="Arial" w:cs="Arial"/>
+          <w:sz w:val="22"/>
+          <w:szCs w:val="22"/>
+          <w:lang w:val="en-US"/>
+        </w:rPr>
+        <w:t>* Connection #0 to host localhost left intact</w:t>
+      </w:r>
+    </w:p>
+    <w:p>
+      <w:pPr>
+        <w:spacing w:line="240" w:lineRule="auto"/>
+        <w:rPr>
+          <w:rFonts w:ascii="Arial" w:hAnsi="Arial" w:cs="Arial"/>
+          <w:sz w:val="22"/>
+          <w:szCs w:val="22"/>
+          <w:lang w:val="en-US"/>
+        </w:rPr>
+      </w:pPr>
+      <w:r>
+        <w:rPr>
+          <w:rFonts w:ascii="Arial" w:hAnsi="Arial" w:cs="Arial"/>
+          <w:sz w:val="22"/>
+          <w:szCs w:val="22"/>
+          <w:lang w:val="en-US"/>
+        </w:rPr>
+        <w:t>PS C:\Users\Artur\vscode\uni&gt; curl.exe -v -X PUT http://localhost:8000/101 --data-binary "@100.jpg"</w:t>
+      </w:r>
+    </w:p>
+    <w:p>
+      <w:pPr>
+        <w:spacing w:line="240" w:lineRule="auto"/>
+        <w:rPr>
+          <w:rFonts w:ascii="Arial" w:hAnsi="Arial" w:cs="Arial"/>
+          <w:sz w:val="22"/>
+          <w:szCs w:val="22"/>
+          <w:lang w:val="en-US"/>
+        </w:rPr>
+      </w:pPr>
+      <w:r>
+        <w:rPr>
+          <w:rFonts w:ascii="Arial" w:hAnsi="Arial" w:cs="Arial"/>
+          <w:sz w:val="22"/>
+          <w:szCs w:val="22"/>
+          <w:lang w:val="en-US"/>
+        </w:rPr>
+        <w:lastRenderedPageBreak/>
+        <w:t>curl: Failed to open 100.jpg</w:t>
+      </w:r>
+    </w:p>
+    <w:p>
+      <w:pPr>
+        <w:spacing w:line="240" w:lineRule="auto"/>
+        <w:rPr>
+          <w:rFonts w:ascii="Arial" w:hAnsi="Arial" w:cs="Arial"/>
+          <w:sz w:val="22"/>
+          <w:szCs w:val="22"/>
+          <w:lang w:val="en-US"/>
+        </w:rPr>
+      </w:pPr>
+      <w:r>
+        <w:rPr>
+          <w:rFonts w:ascii="Arial" w:hAnsi="Arial" w:cs="Arial"/>
+          <w:sz w:val="22"/>
+          <w:szCs w:val="22"/>
+          <w:lang w:val="en-US"/>
+        </w:rPr>
+        <w:t>curl: option --data-binary: error encountered when reading a file</w:t>
+      </w:r>
+    </w:p>
+    <w:p>
+      <w:pPr>
+        <w:spacing w:line="240" w:lineRule="auto"/>
+        <w:rPr>
+          <w:rFonts w:ascii="Arial" w:hAnsi="Arial" w:cs="Arial"/>
+          <w:sz w:val="22"/>
+          <w:szCs w:val="22"/>
+          <w:lang w:val="en-US"/>
+        </w:rPr>
+      </w:pPr>
+      <w:r>
+        <w:rPr>
+          <w:rFonts w:ascii="Arial" w:hAnsi="Arial" w:cs="Arial"/>
+          <w:sz w:val="22"/>
+          <w:szCs w:val="22"/>
+          <w:lang w:val="en-US"/>
+        </w:rPr>
+        <w:t>curl: try 'curl --help' for more information</w:t>
+      </w:r>
+    </w:p>
+    <w:p>
+      <w:pPr>
+        <w:spacing w:line="240" w:lineRule="auto"/>
+        <w:rPr>
+          <w:rFonts w:ascii="Arial" w:hAnsi="Arial" w:cs="Arial"/>
+          <w:sz w:val="22"/>
+          <w:szCs w:val="22"/>
+          <w:lang w:val="en-US"/>
+        </w:rPr>
+      </w:pPr>
+      <w:r>
+        <w:rPr>
+          <w:rFonts w:ascii="Arial" w:hAnsi="Arial" w:cs="Arial"/>
+          <w:sz w:val="22"/>
+          <w:szCs w:val="22"/>
+          <w:lang w:val="en-US"/>
+        </w:rPr>
+        <w:t>PS C:\Users\Artur\vscode\uni&gt; curl.exe -v -X DELETE http://localhost:8000/101</w:t>
+      </w:r>
+    </w:p>
+    <w:p>
+      <w:pPr>
+        <w:spacing w:line="240" w:lineRule="auto"/>
+        <w:rPr>
+          <w:rFonts w:ascii="Arial" w:hAnsi="Arial" w:cs="Arial"/>
+          <w:sz w:val="22"/>
+          <w:szCs w:val="22"/>
+          <w:lang w:val="en-US"/>
+        </w:rPr>
+      </w:pPr>
+      <w:r>
+        <w:rPr>
+          <w:rFonts w:ascii="Arial" w:hAnsi="Arial" w:cs="Arial"/>
+          <w:sz w:val="22"/>
+          <w:szCs w:val="22"/>
+          <w:lang w:val="en-US"/>
+        </w:rPr>
+        <w:t>* Host localhost:8000 was resolved.</w:t>
+      </w:r>
+    </w:p>
+    <w:p>
+      <w:pPr>
+        <w:spacing w:line="240" w:lineRule="auto"/>
+        <w:rPr>
+          <w:rFonts w:ascii="Arial" w:hAnsi="Arial" w:cs="Arial"/>
+          <w:sz w:val="22"/>
+          <w:szCs w:val="22"/>
+          <w:lang w:val="en-US"/>
+        </w:rPr>
+      </w:pPr>
+      <w:r>
+        <w:rPr>
+          <w:rFonts w:ascii="Arial" w:hAnsi="Arial" w:cs="Arial"/>
+          <w:sz w:val="22"/>
+          <w:szCs w:val="22"/>
+          <w:lang w:val="en-US"/>
+        </w:rPr>
+        <w:t>* IPv6: ::1</w:t>
+      </w:r>
+    </w:p>
+    <w:p>
+      <w:pPr>
+        <w:spacing w:line="240" w:lineRule="auto"/>
+        <w:rPr>
+          <w:rFonts w:ascii="Arial" w:hAnsi="Arial" w:cs="Arial"/>
+          <w:sz w:val="22"/>
+          <w:szCs w:val="22"/>
+          <w:lang w:val="en-US"/>
+        </w:rPr>
+      </w:pPr>
+      <w:r>
+        <w:rPr>
+          <w:rFonts w:ascii="Arial" w:hAnsi="Arial" w:cs="Arial"/>
+          <w:sz w:val="22"/>
+          <w:szCs w:val="22"/>
+          <w:lang w:val="en-US"/>
+        </w:rPr>
+        <w:t>* IPv4: 127.0.0.1</w:t>
+      </w:r>
+    </w:p>
+    <w:p>
+      <w:pPr>
+        <w:spacing w:line="240" w:lineRule="auto"/>
+        <w:rPr>
+          <w:rFonts w:ascii="Arial" w:hAnsi="Arial" w:cs="Arial"/>
+          <w:sz w:val="22"/>
+          <w:szCs w:val="22"/>
+          <w:lang w:val="en-US"/>
+        </w:rPr>
+      </w:pPr>
+      <w:r>
+        <w:rPr>
+          <w:rFonts w:ascii="Arial" w:hAnsi="Arial" w:cs="Arial"/>
+          <w:sz w:val="22"/>
+          <w:szCs w:val="22"/>
+          <w:lang w:val="en-US"/>
+        </w:rPr>
+        <w:t>*   Trying [::1]:8000...</w:t>
+      </w:r>
+    </w:p>
+    <w:p>
+      <w:pPr>
+        <w:spacing w:line="240" w:lineRule="auto"/>
+        <w:rPr>
+          <w:rFonts w:ascii="Arial" w:hAnsi="Arial" w:cs="Arial"/>
+          <w:sz w:val="22"/>
+          <w:szCs w:val="22"/>
+          <w:lang w:val="en-US"/>
+        </w:rPr>
+      </w:pPr>
+      <w:r>
+        <w:rPr>
+          <w:rFonts w:ascii="Arial" w:hAnsi="Arial" w:cs="Arial"/>
+          <w:sz w:val="22"/>
+          <w:szCs w:val="22"/>
+          <w:lang w:val="en-US"/>
+        </w:rPr>
+        <w:t>* Connected to localhost (::1) port 8000</w:t>
+      </w:r>
+    </w:p>
+    <w:p>
+      <w:pPr>
+        <w:spacing w:line="240" w:lineRule="auto"/>
+        <w:rPr>
+          <w:rFonts w:ascii="Arial" w:hAnsi="Arial" w:cs="Arial"/>
+          <w:sz w:val="22"/>
+          <w:szCs w:val="22"/>
+          <w:lang w:val="en-US"/>
+        </w:rPr>
+      </w:pPr>
+      <w:r>
+        <w:rPr>
+          <w:rFonts w:ascii="Arial" w:hAnsi="Arial" w:cs="Arial"/>
+          <w:sz w:val="22"/>
+          <w:szCs w:val="22"/>
+          <w:lang w:val="en-US"/>
+        </w:rPr>
+        <w:t>* using HTTP/1.x</w:t>
+      </w:r>
+    </w:p>
+    <w:p>
+      <w:pPr>
+        <w:spacing w:line="240" w:lineRule="auto"/>
+        <w:rPr>
+          <w:rFonts w:ascii="Arial" w:hAnsi="Arial" w:cs="Arial"/>
+          <w:sz w:val="22"/>
+          <w:szCs w:val="22"/>
+          <w:lang w:val="en-US"/>
+        </w:rPr>
+      </w:pPr>
+      <w:r>
+        <w:rPr>
+          <w:rFonts w:ascii="Arial" w:hAnsi="Arial" w:cs="Arial"/>
+          <w:sz w:val="22"/>
+          <w:szCs w:val="22"/>
+          <w:lang w:val="en-US"/>
+        </w:rPr>
+        <w:t>&gt; DELETE /101 HTTP/1.1</w:t>
+      </w:r>
+    </w:p>
+    <w:p>
+      <w:pPr>
+        <w:spacing w:line="240" w:lineRule="auto"/>
+        <w:rPr>
+          <w:rFonts w:ascii="Arial" w:hAnsi="Arial" w:cs="Arial"/>
+          <w:sz w:val="22"/>
+          <w:szCs w:val="22"/>
+          <w:lang w:val="en-US"/>
+        </w:rPr>
+      </w:pPr>
+      <w:r>
+        <w:rPr>
+          <w:rFonts w:ascii="Arial" w:hAnsi="Arial" w:cs="Arial"/>
+          <w:sz w:val="22"/>
+          <w:szCs w:val="22"/>
+          <w:lang w:val="en-US"/>
+        </w:rPr>
+        <w:t>&gt; Host: localhost:8000</w:t>
+      </w:r>
+    </w:p>
+    <w:p>
+      <w:pPr>
+        <w:spacing w:line="240" w:lineRule="auto"/>
+        <w:rPr>
+          <w:rFonts w:ascii="Arial" w:hAnsi="Arial" w:cs="Arial"/>
+          <w:sz w:val="22"/>
+          <w:szCs w:val="22"/>
+          <w:lang w:val="en-US"/>
+        </w:rPr>
+      </w:pPr>
+      <w:r>
+        <w:rPr>
+          <w:rFonts w:ascii="Arial" w:hAnsi="Arial" w:cs="Arial"/>
+          <w:sz w:val="22"/>
+          <w:szCs w:val="22"/>
+          <w:lang w:val="en-US"/>
+        </w:rPr>
+        <w:t>&gt; User-Agent: curl/8.13.0</w:t>
+      </w:r>
+    </w:p>
+    <w:p>
+      <w:pPr>
+        <w:spacing w:line="240" w:lineRule="auto"/>
+        <w:rPr>
+          <w:rFonts w:ascii="Arial" w:hAnsi="Arial" w:cs="Arial"/>
+          <w:sz w:val="22"/>
+          <w:szCs w:val="22"/>
+          <w:lang w:val="en-US"/>
+        </w:rPr>
+      </w:pPr>
+      <w:r>
+        <w:rPr>
+          <w:rFonts w:ascii="Arial" w:hAnsi="Arial" w:cs="Arial"/>
+          <w:sz w:val="22"/>
+          <w:szCs w:val="22"/>
+          <w:lang w:val="en-US"/>
+        </w:rPr>
+        <w:t>&gt; Accept: */*</w:t>
+      </w:r>
+    </w:p>
+    <w:p>
+      <w:pPr>
+        <w:spacing w:line="240" w:lineRule="auto"/>
+        <w:rPr>
+          <w:rFonts w:ascii="Arial" w:hAnsi="Arial" w:cs="Arial"/>
+          <w:sz w:val="22"/>
+          <w:szCs w:val="22"/>
+          <w:lang w:val="en-US"/>
+        </w:rPr>
+      </w:pPr>
+      <w:r>
+        <w:rPr>
+          <w:rFonts w:ascii="Arial" w:hAnsi="Arial" w:cs="Arial"/>
+          <w:sz w:val="22"/>
+          <w:szCs w:val="22"/>
+          <w:lang w:val="en-US"/>
+        </w:rPr>
+        <w:t>&gt;</w:t>
+      </w:r>
+    </w:p>
+    <w:p>
+      <w:pPr>
+        <w:spacing w:line="240" w:lineRule="auto"/>
+        <w:rPr>
+          <w:rFonts w:ascii="Arial" w:hAnsi="Arial" w:cs="Arial"/>
+          <w:sz w:val="22"/>
+          <w:szCs w:val="22"/>
+          <w:lang w:val="en-US"/>
+        </w:rPr>
+      </w:pPr>
+      <w:r>
+        <w:rPr>
+          <w:rFonts w:ascii="Arial" w:hAnsi="Arial" w:cs="Arial"/>
+          <w:sz w:val="22"/>
+          <w:szCs w:val="22"/>
+          <w:lang w:val="en-US"/>
+        </w:rPr>
+        <w:t>&lt; HTTP/1.1 404 Not Found</w:t>
+      </w:r>
+    </w:p>
+    <w:p>
+      <w:pPr>
+        <w:spacing w:line="240" w:lineRule="auto"/>
+        <w:rPr>
+          <w:rFonts w:ascii="Arial" w:hAnsi="Arial" w:cs="Arial"/>
+          <w:sz w:val="22"/>
+          <w:szCs w:val="22"/>
+          <w:lang w:val="en-US"/>
+        </w:rPr>
+      </w:pPr>
+      <w:r>
+        <w:rPr>
+          <w:rFonts w:ascii="Arial" w:hAnsi="Arial" w:cs="Arial"/>
+          <w:sz w:val="22"/>
+          <w:szCs w:val="22"/>
+          <w:lang w:val="en-US"/>
+        </w:rPr>
+        <w:t>&lt; Date: Mon, 23 Feb 2026 05:52:08 GMT</w:t>
+      </w:r>
+    </w:p>
+    <w:p>
+      <w:pPr>
+        <w:spacing w:line="240" w:lineRule="auto"/>
+        <w:rPr>
+          <w:rFonts w:ascii="Arial" w:hAnsi="Arial" w:cs="Arial"/>
+          <w:sz w:val="22"/>
+          <w:szCs w:val="22"/>
+          <w:lang w:val="en-US"/>
+        </w:rPr>
+      </w:pPr>
+      <w:r>
+        <w:rPr>
+          <w:rFonts w:ascii="Arial" w:hAnsi="Arial" w:cs="Arial"/>
+          <w:sz w:val="22"/>
+          <w:szCs w:val="22"/>
+          <w:lang w:val="en-US"/>
+        </w:rPr>
+        <w:t>&lt; Connection: keep-alive</w:t>
+      </w:r>
+    </w:p>
+    <w:p>
+      <w:pPr>
+        <w:spacing w:line="240" w:lineRule="auto"/>
+        <w:rPr>
+          <w:rFonts w:ascii="Arial" w:hAnsi="Arial" w:cs="Arial"/>
+          <w:sz w:val="22"/>
+          <w:szCs w:val="22"/>
+          <w:lang w:val="en-US"/>
+        </w:rPr>
+      </w:pPr>
+      <w:r>
+        <w:rPr>
+          <w:rFonts w:ascii="Arial" w:hAnsi="Arial" w:cs="Arial"/>
+          <w:sz w:val="22"/>
+          <w:szCs w:val="22"/>
+          <w:lang w:val="en-US"/>
+        </w:rPr>
+        <w:t>&lt; Keep-Alive: timeout=5</w:t>
+      </w:r>
+    </w:p>
+    <w:p>
+      <w:pPr>
+        <w:spacing w:line="240" w:lineRule="auto"/>
+        <w:rPr>
+          <w:rFonts w:ascii="Arial" w:hAnsi="Arial" w:cs="Arial"/>
+          <w:sz w:val="22"/>
+          <w:szCs w:val="22"/>
+          <w:lang w:val="en-US"/>
+        </w:rPr>
+      </w:pPr>
+      <w:r>
+        <w:rPr>
+          <w:rFonts w:ascii="Arial" w:hAnsi="Arial" w:cs="Arial"/>
+          <w:sz w:val="22"/>
+          <w:szCs w:val="22"/>
+          <w:lang w:val="en-US"/>
+        </w:rPr>
+        <w:t>&lt; Transfer-Encoding: chunked</w:t>
+      </w:r>
+    </w:p>
+    <w:p>
+      <w:pPr>
+        <w:spacing w:line="240" w:lineRule="auto"/>
+        <w:rPr>
+          <w:rFonts w:ascii="Arial" w:hAnsi="Arial" w:cs="Arial"/>
+          <w:sz w:val="22"/>
+          <w:szCs w:val="22"/>
+          <w:lang w:val="en-US"/>
+        </w:rPr>
+      </w:pPr>
+      <w:r>
+        <w:rPr>
+          <w:rFonts w:ascii="Arial" w:hAnsi="Arial" w:cs="Arial"/>
+          <w:sz w:val="22"/>
+          <w:szCs w:val="22"/>
+          <w:lang w:val="en-US"/>
+        </w:rPr>
+        <w:t>&lt;</w:t>
+      </w:r>
+    </w:p>
+    <w:p>
+      <w:pPr>
+        <w:spacing w:line="240" w:lineRule="auto"/>
+        <w:rPr>
+          <w:rFonts w:ascii="Arial" w:hAnsi="Arial" w:cs="Arial"/>
+          <w:sz w:val="22"/>
+          <w:szCs w:val="22"/>
+          <w:lang w:val="en-US"/>
+        </w:rPr>
+      </w:pPr>
+      <w:r>
+        <w:rPr>
+          <w:rFonts w:ascii="Arial" w:hAnsi="Arial" w:cs="Arial"/>
+          <w:sz w:val="22"/>
+          <w:szCs w:val="22"/>
+          <w:lang w:val="en-US"/>
+        </w:rPr>
+        <w:t xml:space="preserve">Warning: Binary output can mess up your terminal. Use "--output -" to tell curl to output it to your terminal anyway, or    </w:t>
+      </w:r>
+    </w:p>
+    <w:p>
+      <w:pPr>
+        <w:spacing w:line="240" w:lineRule="auto"/>
+        <w:rPr>
+          <w:rFonts w:ascii="Arial" w:hAnsi="Arial" w:cs="Arial"/>
+          <w:sz w:val="22"/>
+          <w:szCs w:val="22"/>
+          <w:lang w:val="en-US"/>
+        </w:rPr>
+      </w:pPr>
+      <w:r>
+        <w:rPr>
+          <w:rFonts w:ascii="Arial" w:hAnsi="Arial" w:cs="Arial"/>
+          <w:sz w:val="22"/>
+          <w:szCs w:val="22"/>
+          <w:lang w:val="en-US"/>
+        </w:rPr>
+        <w:t>Warning: consider "--output &lt;FILE&gt;" to save to a file.</w:t>
+      </w:r>
+    </w:p>
+    <w:p>
+      <w:pPr>
+        <w:spacing w:line="240" w:lineRule="auto"/>
+        <w:rPr>
+          <w:rFonts w:ascii="Arial" w:hAnsi="Arial" w:cs="Arial"/>
+          <w:sz w:val="22"/>
+          <w:szCs w:val="22"/>
+          <w:lang w:val="en-US"/>
+        </w:rPr>
+      </w:pPr>
+      <w:r>
+        <w:rPr>
+          <w:rFonts w:ascii="Arial" w:hAnsi="Arial" w:cs="Arial"/>
+          <w:sz w:val="22"/>
+          <w:szCs w:val="22"/>
+          <w:lang w:val="en-US"/>
+        </w:rPr>
+        <w:t>* client returned ERROR on write of 16384 bytes</w:t>
+      </w:r>
+    </w:p>
+    <w:p>
+      <w:pPr>
+        <w:spacing w:line="240" w:lineRule="auto"/>
+        <w:rPr>
+          <w:rFonts w:ascii="Arial" w:hAnsi="Arial" w:cs="Arial"/>
+          <w:sz w:val="22"/>
+          <w:szCs w:val="22"/>
+          <w:lang w:val="en-US"/>
+        </w:rPr>
+      </w:pPr>
+      <w:r>
+        <w:rPr>
+          <w:rFonts w:ascii="Arial" w:hAnsi="Arial" w:cs="Arial"/>
+          <w:sz w:val="22"/>
+          <w:szCs w:val="22"/>
+          <w:lang w:val="en-US"/>
+        </w:rPr>
+        <w:t>* Failed reading the chunked-encoded stream</w:t>
+      </w:r>
+    </w:p>
+    <w:p>
+      <w:pPr>
+        <w:spacing w:line="240" w:lineRule="auto"/>
+        <w:rPr>
+          <w:rFonts w:ascii="Arial" w:hAnsi="Arial" w:cs="Arial"/>
+          <w:sz w:val="22"/>
+          <w:szCs w:val="22"/>
+          <w:lang w:val="en-US"/>
+        </w:rPr>
+      </w:pPr>
+      <w:r>
+        <w:rPr>
+          <w:rFonts w:ascii="Arial" w:hAnsi="Arial" w:cs="Arial"/>
+          <w:sz w:val="22"/>
+          <w:szCs w:val="22"/>
+          <w:lang w:val="en-US"/>
+        </w:rPr>
+        <w:t>* closing connection #0</w:t>
+      </w:r>
+    </w:p>
+    <w:p>
+      <w:pPr>
+        <w:spacing w:line="240" w:lineRule="auto"/>
+        <w:rPr>
+          <w:rFonts w:ascii="Arial" w:hAnsi="Arial" w:cs="Arial"/>
+          <w:sz w:val="22"/>
+          <w:szCs w:val="22"/>
+          <w:lang w:val="en-US"/>
+        </w:rPr>
+      </w:pPr>
+      <w:r>
+        <w:rPr>
+          <w:rFonts w:ascii="Arial" w:hAnsi="Arial" w:cs="Arial"/>
+          <w:sz w:val="22"/>
+          <w:szCs w:val="22"/>
+          <w:lang w:val="en-US"/>
+        </w:rPr>
+        <w:t>PS C:\Users\Artur\vscode\uni&gt; curl.exe -v -X POST http://localhost:8000/200</w:t>
+      </w:r>
+    </w:p>
+    <w:p>
+      <w:pPr>
+        <w:spacing w:line="240" w:lineRule="auto"/>
+        <w:rPr>
+          <w:rFonts w:ascii="Arial" w:hAnsi="Arial" w:cs="Arial"/>
+          <w:sz w:val="22"/>
+          <w:szCs w:val="22"/>
+          <w:lang w:val="en-US"/>
+        </w:rPr>
+      </w:pPr>
+      <w:r>
+        <w:rPr>
+          <w:rFonts w:ascii="Arial" w:hAnsi="Arial" w:cs="Arial"/>
+          <w:sz w:val="22"/>
+          <w:szCs w:val="22"/>
+          <w:lang w:val="en-US"/>
+        </w:rPr>
+        <w:t>* Host localhost:8000 was resolved.</w:t>
+      </w:r>
+    </w:p>
+    <w:p>
+      <w:pPr>
+        <w:spacing w:line="240" w:lineRule="auto"/>
+        <w:rPr>
+          <w:rFonts w:ascii="Arial" w:hAnsi="Arial" w:cs="Arial"/>
+          <w:sz w:val="22"/>
+          <w:szCs w:val="22"/>
+          <w:lang w:val="en-US"/>
+        </w:rPr>
+      </w:pPr>
+      <w:r>
+        <w:rPr>
+          <w:rFonts w:ascii="Arial" w:hAnsi="Arial" w:cs="Arial"/>
+          <w:sz w:val="22"/>
+          <w:szCs w:val="22"/>
+          <w:lang w:val="en-US"/>
+        </w:rPr>
+        <w:t>* IPv6: ::1</w:t>
+      </w:r>
+    </w:p>
+    <w:p>
+      <w:pPr>
+        <w:spacing w:line="240" w:lineRule="auto"/>
+        <w:rPr>
+          <w:rFonts w:ascii="Arial" w:hAnsi="Arial" w:cs="Arial"/>
+          <w:sz w:val="22"/>
+          <w:szCs w:val="22"/>
+          <w:lang w:val="en-US"/>
+        </w:rPr>
+      </w:pPr>
+      <w:r>
+        <w:rPr>
+          <w:rFonts w:ascii="Arial" w:hAnsi="Arial" w:cs="Arial"/>
+          <w:sz w:val="22"/>
+          <w:szCs w:val="22"/>
+          <w:lang w:val="en-US"/>
+        </w:rPr>
+        <w:t>* IPv4: 127.0.0.1</w:t>
+      </w:r>
+    </w:p>
+    <w:p>
+      <w:pPr>
+        <w:spacing w:line="240" w:lineRule="auto"/>
+        <w:rPr>
+          <w:rFonts w:ascii="Arial" w:hAnsi="Arial" w:cs="Arial"/>
+          <w:sz w:val="22"/>
+          <w:szCs w:val="22"/>
+          <w:lang w:val="en-US"/>
+        </w:rPr>
+      </w:pPr>
+      <w:r>
+        <w:rPr>
+          <w:rFonts w:ascii="Arial" w:hAnsi="Arial" w:cs="Arial"/>
+          <w:sz w:val="22"/>
+          <w:szCs w:val="22"/>
+          <w:lang w:val="en-US"/>
+        </w:rPr>
+        <w:t>*   Trying [::1]:8000...</w:t>
+      </w:r>
+    </w:p>
+    <w:p>
+      <w:pPr>
+        <w:spacing w:line="240" w:lineRule="auto"/>
+        <w:rPr>
+          <w:rFonts w:ascii="Arial" w:hAnsi="Arial" w:cs="Arial"/>
+          <w:sz w:val="22"/>
+          <w:szCs w:val="22"/>
+          <w:lang w:val="en-US"/>
+        </w:rPr>
+      </w:pPr>
+      <w:r>
+        <w:rPr>
+          <w:rFonts w:ascii="Arial" w:hAnsi="Arial" w:cs="Arial"/>
+          <w:sz w:val="22"/>
+          <w:szCs w:val="22"/>
+          <w:lang w:val="en-US"/>
+        </w:rPr>
+        <w:t>* Connected to localhost (::1) port 8000</w:t>
+      </w:r>
+    </w:p>
+    <w:p>
+      <w:pPr>
+        <w:spacing w:line="240" w:lineRule="auto"/>
+        <w:rPr>
+          <w:rFonts w:ascii="Arial" w:hAnsi="Arial" w:cs="Arial"/>
+          <w:sz w:val="22"/>
+          <w:szCs w:val="22"/>
+          <w:lang w:val="en-US"/>
+        </w:rPr>
+      </w:pPr>
+      <w:r>
+        <w:rPr>
+          <w:rFonts w:ascii="Arial" w:hAnsi="Arial" w:cs="Arial"/>
+          <w:sz w:val="22"/>
+          <w:szCs w:val="22"/>
+          <w:lang w:val="en-US"/>
+        </w:rPr>
+        <w:t>* using HTTP/1.x</w:t>
+      </w:r>
+    </w:p>
+    <w:p>
+      <w:pPr>
+        <w:spacing w:line="240" w:lineRule="auto"/>
+        <w:rPr>
+          <w:rFonts w:ascii="Arial" w:hAnsi="Arial" w:cs="Arial"/>
+          <w:sz w:val="22"/>
+          <w:szCs w:val="22"/>
+          <w:lang w:val="en-US"/>
+        </w:rPr>
+      </w:pPr>
+      <w:r>
+        <w:rPr>
+          <w:rFonts w:ascii="Arial" w:hAnsi="Arial" w:cs="Arial"/>
+          <w:sz w:val="22"/>
+          <w:szCs w:val="22"/>
+          <w:lang w:val="en-US"/>
+        </w:rPr>
+        <w:t>&gt; POST /200 HTTP/1.1</w:t>
+      </w:r>
+    </w:p>
+    <w:p>
+      <w:pPr>
+        <w:spacing w:line="240" w:lineRule="auto"/>
+        <w:rPr>
+          <w:rFonts w:ascii="Arial" w:hAnsi="Arial" w:cs="Arial"/>
+          <w:sz w:val="22"/>
+          <w:szCs w:val="22"/>
+          <w:lang w:val="en-US"/>
+        </w:rPr>
+      </w:pPr>
+      <w:r>
+        <w:rPr>
+          <w:rFonts w:ascii="Arial" w:hAnsi="Arial" w:cs="Arial"/>
+          <w:sz w:val="22"/>
+          <w:szCs w:val="22"/>
+          <w:lang w:val="en-US"/>
+        </w:rPr>
+        <w:t>&gt; Host: localhost:8000</w:t>
+      </w:r>
+    </w:p>
+    <w:p>
+      <w:pPr>
+        <w:spacing w:line="240" w:lineRule="auto"/>
+        <w:rPr>
+          <w:rFonts w:ascii="Arial" w:hAnsi="Arial" w:cs="Arial"/>
+          <w:sz w:val="22"/>
+          <w:szCs w:val="22"/>
+          <w:lang w:val="en-US"/>
+        </w:rPr>
+      </w:pPr>
+      <w:r>
+        <w:rPr>
+          <w:rFonts w:ascii="Arial" w:hAnsi="Arial" w:cs="Arial"/>
+          <w:sz w:val="22"/>
+          <w:szCs w:val="22"/>
+          <w:lang w:val="en-US"/>
+        </w:rPr>
+        <w:t>&gt; User-Agent: curl/8.13.0</w:t>
+      </w:r>
+    </w:p>
+    <w:p>
+      <w:pPr>
+        <w:spacing w:line="240" w:lineRule="auto"/>
+        <w:rPr>
+          <w:rFonts w:ascii="Arial" w:hAnsi="Arial" w:cs="Arial"/>
+          <w:sz w:val="22"/>
+          <w:szCs w:val="22"/>
+          <w:lang w:val="en-US"/>
+        </w:rPr>
+      </w:pPr>
+      <w:r>
+        <w:rPr>
+          <w:rFonts w:ascii="Arial" w:hAnsi="Arial" w:cs="Arial"/>
+          <w:sz w:val="22"/>
+          <w:szCs w:val="22"/>
+          <w:lang w:val="en-US"/>
+        </w:rPr>
+        <w:lastRenderedPageBreak/>
+        <w:t>&gt; Accept: */*</w:t>
+      </w:r>
+    </w:p>
+    <w:p>
+      <w:pPr>
+        <w:spacing w:line="240" w:lineRule="auto"/>
+        <w:rPr>
+          <w:rFonts w:ascii="Arial" w:hAnsi="Arial" w:cs="Arial"/>
+          <w:sz w:val="22"/>
+          <w:szCs w:val="22"/>
+          <w:lang w:val="en-US"/>
+        </w:rPr>
+      </w:pPr>
+      <w:r>
+        <w:rPr>
+          <w:rFonts w:ascii="Arial" w:hAnsi="Arial" w:cs="Arial"/>
+          <w:sz w:val="22"/>
+          <w:szCs w:val="22"/>
+          <w:lang w:val="en-US"/>
+        </w:rPr>
+        <w:t>&gt;</w:t>
+      </w:r>
+    </w:p>
+    <w:p>
+      <w:pPr>
+        <w:spacing w:line="240" w:lineRule="auto"/>
+        <w:rPr>
+          <w:rFonts w:ascii="Arial" w:hAnsi="Arial" w:cs="Arial"/>
+          <w:sz w:val="22"/>
+          <w:szCs w:val="22"/>
+          <w:lang w:val="en-US"/>
+        </w:rPr>
+      </w:pPr>
+      <w:r>
+        <w:rPr>
+          <w:rFonts w:ascii="Arial" w:hAnsi="Arial" w:cs="Arial"/>
+          <w:sz w:val="22"/>
+          <w:szCs w:val="22"/>
+          <w:lang w:val="en-US"/>
+        </w:rPr>
+        <w:t>&lt; HTTP/1.1 405 Method Not Allowed</w:t>
+      </w:r>
+    </w:p>
+    <w:p>
+      <w:pPr>
+        <w:spacing w:line="240" w:lineRule="auto"/>
+        <w:rPr>
+          <w:rFonts w:ascii="Arial" w:hAnsi="Arial" w:cs="Arial"/>
+          <w:sz w:val="22"/>
+          <w:szCs w:val="22"/>
+          <w:lang w:val="en-US"/>
+        </w:rPr>
+      </w:pPr>
+      <w:r>
+        <w:rPr>
+          <w:rFonts w:ascii="Arial" w:hAnsi="Arial" w:cs="Arial"/>
+          <w:sz w:val="22"/>
+          <w:szCs w:val="22"/>
+          <w:lang w:val="en-US"/>
+        </w:rPr>
+        <w:t>&lt; Date: Mon, 23 Feb 2026 05:52:08 GMT</w:t>
+      </w:r>
+    </w:p>
+    <w:p>
+      <w:pPr>
+        <w:spacing w:line="240" w:lineRule="auto"/>
+        <w:rPr>
+          <w:rFonts w:ascii="Arial" w:hAnsi="Arial" w:cs="Arial"/>
+          <w:sz w:val="22"/>
+          <w:szCs w:val="22"/>
+          <w:lang w:val="en-US"/>
+        </w:rPr>
+      </w:pPr>
+      <w:r>
+        <w:rPr>
+          <w:rFonts w:ascii="Arial" w:hAnsi="Arial" w:cs="Arial"/>
+          <w:sz w:val="22"/>
+          <w:szCs w:val="22"/>
+          <w:lang w:val="en-US"/>
+        </w:rPr>
+        <w:t>&lt; Connection: keep-alive</w:t>
+      </w:r>
+    </w:p>
+    <w:p>
+      <w:pPr>
+        <w:spacing w:line="240" w:lineRule="auto"/>
+        <w:rPr>
+          <w:rFonts w:ascii="Arial" w:hAnsi="Arial" w:cs="Arial"/>
+          <w:sz w:val="22"/>
+          <w:szCs w:val="22"/>
+          <w:lang w:val="en-US"/>
+        </w:rPr>
+      </w:pPr>
+      <w:r>
+        <w:rPr>
+          <w:rFonts w:ascii="Arial" w:hAnsi="Arial" w:cs="Arial"/>
+          <w:sz w:val="22"/>
+          <w:szCs w:val="22"/>
+          <w:lang w:val="en-US"/>
+        </w:rPr>
+        <w:t>&lt; Keep-Alive: timeout=5</w:t>
+      </w:r>
+    </w:p>
+    <w:p>
+      <w:pPr>
+        <w:spacing w:line="240" w:lineRule="auto"/>
+        <w:rPr>
+          <w:rFonts w:ascii="Arial" w:hAnsi="Arial" w:cs="Arial"/>
+          <w:sz w:val="22"/>
+          <w:szCs w:val="22"/>
+          <w:lang w:val="en-US"/>
+        </w:rPr>
+      </w:pPr>
+      <w:r>
+        <w:rPr>
+          <w:rFonts w:ascii="Arial" w:hAnsi="Arial" w:cs="Arial"/>
+          <w:sz w:val="22"/>
+          <w:szCs w:val="22"/>
+          <w:lang w:val="en-US"/>
+        </w:rPr>
+        <w:t>&lt; Transfer-Encoding: chunked</w:t>
+      </w:r>
+    </w:p>
+    <w:p>
+      <w:pPr>
+        <w:spacing w:line="240" w:lineRule="auto"/>
+        <w:rPr>
+          <w:rFonts w:ascii="Arial" w:hAnsi="Arial" w:cs="Arial"/>
+          <w:sz w:val="22"/>
+          <w:szCs w:val="22"/>
+          <w:lang w:val="en-US"/>
+        </w:rPr>
+      </w:pPr>
+      <w:r>
+        <w:rPr>
+          <w:rFonts w:ascii="Arial" w:hAnsi="Arial" w:cs="Arial"/>
+          <w:sz w:val="22"/>
+          <w:szCs w:val="22"/>
+          <w:lang w:val="en-US"/>
+        </w:rPr>
+        <w:t>&lt;</w:t>
+      </w:r>
+    </w:p>
+    <w:p>
+      <w:pPr>
+        <w:spacing w:line="240" w:lineRule="auto"/>
+        <w:rPr>
+          <w:rFonts w:ascii="Arial" w:hAnsi="Arial" w:cs="Arial"/>
+          <w:sz w:val="22"/>
+          <w:szCs w:val="22"/>
+          <w:lang w:val="en-US"/>
+        </w:rPr>
+      </w:pPr>
+      <w:r>
+        <w:rPr>
+          <w:rFonts w:ascii="Arial" w:hAnsi="Arial" w:cs="Arial"/>
+          <w:sz w:val="22"/>
+          <w:szCs w:val="22"/>
+          <w:lang w:val="en-US"/>
+        </w:rPr>
+        <w:t>Method Not Allowed* Connection #0 to host localhost left intact</w:t>
+      </w:r>
+    </w:p>
+    <w:p>
+      <w:pPr>
+        <w:rPr>
+          <w:b/>
+          <w:bCs/>
+          <w:lang w:val="en-US"/>
+        </w:rPr>
+      </w:pPr>
+      <w:r>
+        <w:rPr>
+          <mc:AlternateContent>
+            <mc:Choice Requires="w16se"/>
+            <mc:Fallback>
+              <w:rFonts w:ascii="Segoe UI Emoji" w:eastAsia="Segoe UI Emoji" w:hAnsi="Segoe UI Emoji" w:cs="Segoe UI Emoji"/>
+            </mc:Fallback>
+          </mc:AlternateContent>
+          <w:lang w:val="en-US"/>
+        </w:rPr>
+        <mc:AlternateContent>
+          <mc:Choice Requires="w16se">
+            <w16se:symEx w16se:font="Segoe UI Emoji" w16se:char="1F63D"/>
+          </mc:Choice>
+          <mc:Fallback>
+            <w:t>😽</w:t>
+          </mc:Fallback>
+        </mc:AlternateContent>
+      </w:r>
+      <w:r>
+        <w:rPr>
+          <mc:AlternateContent>
+            <mc:Choice Requires="w16se"/>
+            <mc:Fallback>
+              <w:rFonts w:ascii="Segoe UI Emoji" w:eastAsia="Segoe UI Emoji" w:hAnsi="Segoe UI Emoji" w:cs="Segoe UI Emoji"/>
+            </mc:Fallback>
+          </mc:AlternateContent>
+          <w:lang w:val="en-US"/>
+        </w:rPr>
+        <mc:AlternateContent>
+          <mc:Choice Requires="w16se">
+            <w16se:symEx w16se:font="Segoe UI Emoji" w16se:char="1F63D"/>
+          </mc:Choice>
+          <mc:Fallback>
+            <w:t>😽</w:t>
+          </mc:Fallback>
+        </mc:AlternateContent>
+      </w:r>
+      <w:r>
+        <w:rPr>
+          <mc:AlternateContent>
+            <mc:Choice Requires="w16se"/>
+            <mc:Fallback>
+              <w:rFonts w:ascii="Segoe UI Emoji" w:eastAsia="Segoe UI Emoji" w:hAnsi="Segoe UI Emoji" w:cs="Segoe UI Emoji"/>
+            </mc:Fallback>
+          </mc:AlternateContent>
+          <w:lang w:val="en-US"/>
+        </w:rPr>
+        <mc:AlternateContent>
+          <mc:Choice Requires="w16se">
+            <w16se:symEx w16se:font="Segoe UI Emoji" w16se:char="1F63D"/>
+          </mc:Choice>
+          <mc:Fallback>
+            <w:t>😽</w:t>
+          </mc:Fallback>
+        </mc:AlternateContent>
+      </w:r>
+      <w:r>
+        <w:rPr>
+          <mc:AlternateContent>
+            <mc:Choice Requires="w16se"/>
+            <mc:Fallback>
+              <w:rFonts w:ascii="Segoe UI Emoji" w:eastAsia="Segoe UI Emoji" w:hAnsi="Segoe UI Emoji" w:cs="Segoe UI Emoji"/>
+            </mc:Fallback>
+          </mc:AlternateContent>
+          <w:lang w:val="en-US"/>
+        </w:rPr>
+        <mc:AlternateContent>
+          <mc:Choice Requires="w16se">
+            <w16se:symEx w16se:font="Segoe UI Emoji" w16se:char="1F63D"/>
+          </mc:Choice>
+          <mc:Fallback>
+            <w:t>😽</w:t>
+          </mc:Fallback>
+        </mc:AlternateContent>
+      </w:r>
+      <w:r>
+        <w:rPr>
+          <mc:AlternateContent>
+            <mc:Choice Requires="w16se"/>
+            <mc:Fallback>
+              <w:rFonts w:ascii="Segoe UI Emoji" w:eastAsia="Segoe UI Emoji" w:hAnsi="Segoe UI Emoji" w:cs="Segoe UI Emoji"/>
+            </mc:Fallback>
+          </mc:AlternateContent>
+          <w:lang w:val="en-US"/>
+        </w:rPr>
+        <mc:AlternateContent>
+          <mc:Choice Requires="w16se">
+            <w16se:symEx w16se:font="Segoe UI Emoji" w16se:char="1F63D"/>
+          </mc:Choice>
+          <mc:Fallback>
+            <w:t>😽</w:t>
+          </mc:Fallback>
+        </mc:AlternateContent>
+      </w:r>
+      <w:r>
+        <w:rPr>
+          <mc:AlternateContent>
+            <mc:Choice Requires="w16se"/>
+            <mc:Fallback>
+              <w:rFonts w:ascii="Segoe UI Emoji" w:eastAsia="Segoe UI Emoji" w:hAnsi="Segoe UI Emoji" w:cs="Segoe UI Emoji"/>
+            </mc:Fallback>
+          </mc:AlternateContent>
+          <w:lang w:val="en-US"/>
+        </w:rPr>
+        <mc:AlternateContent>
+          <mc:Choice Requires="w16se">
+            <w16se:symEx w16se:font="Segoe UI Emoji" w16se:char="1F63D"/>
+          </mc:Choice>
+          <mc:Fallback>
+            <w:t>😽</w:t>
+          </mc:Fallback>
+        </mc:AlternateContent>
+      </w:r>
+      <w:r>
+        <w:rPr>
+          <mc:AlternateContent>
+            <mc:Choice Requires="w16se"/>
+            <mc:Fallback>
+              <w:rFonts w:ascii="Segoe UI Emoji" w:eastAsia="Segoe UI Emoji" w:hAnsi="Segoe UI Emoji" w:cs="Segoe UI Emoji"/>
+            </mc:Fallback>
+          </mc:AlternateContent>
+          <w:lang w:val="en-US"/>
+        </w:rPr>
+        <mc:AlternateContent>
+          <mc:Choice Requires="w16se">
+            <w16se:symEx w16se:font="Segoe UI Emoji" w16se:char="1F63D"/>
+          </mc:Choice>
+          <mc:Fallback>
+            <w:t>😽</w:t>
+          </mc:Fallback>
+        </mc:AlternateContent>
+      </w:r>
+      <w:r>
+        <w:rPr>
+          <mc:AlternateContent>
+            <mc:Choice Requires="w16se"/>
+            <mc:Fallback>
+              <w:rFonts w:ascii="Segoe UI Emoji" w:eastAsia="Segoe UI Emoji" w:hAnsi="Segoe UI Emoji" w:cs="Segoe UI Emoji"/>
+            </mc:Fallback>
+          </mc:AlternateContent>
+          <w:lang w:val="en-US"/>
+        </w:rPr>
+        <mc:AlternateContent>
+          <mc:Choice Requires="w16se">
+            <w16se:symEx w16se:font="Segoe UI Emoji" w16se:char="1F63D"/>
+          </mc:Choice>
+          <mc:Fallback>
+            <w:t>😽</w:t>
+          </mc:Fallback>
+        </mc:AlternateContent>
+      </w:r>
+      <w:r>
+        <w:rPr>
+          <mc:AlternateContent>
+            <mc:Choice Requires="w16se"/>
+            <mc:Fallback>
+              <w:rFonts w:ascii="Segoe UI Emoji" w:eastAsia="Segoe UI Emoji" w:hAnsi="Segoe UI Emoji" w:cs="Segoe UI Emoji"/>
+            </mc:Fallback>
+          </mc:AlternateContent>
+          <w:lang w:val="en-US"/>
+        </w:rPr>
+        <mc:AlternateContent>
+          <mc:Choice Requires="w16se">
+            <w16se:symEx w16se:font="Segoe UI Emoji" w16se:char="1F63D"/>
+          </mc:Choice>
+          <mc:Fallback>
+            <w:t>😽</w:t>
+          </mc:Fallback>
+        </mc:AlternateContent>
+      </w:r>
+      <w:r>
+        <w:rPr>
+          <mc:AlternateContent>
+            <mc:Choice Requires="w16se"/>
+            <mc:Fallback>
+              <w:rFonts w:ascii="Segoe UI Emoji" w:eastAsia="Segoe UI Emoji" w:hAnsi="Segoe UI Emoji" w:cs="Segoe UI Emoji"/>
+            </mc:Fallback>
+          </mc:AlternateContent>
+          <w:lang w:val="en-US"/>
+        </w:rPr>
+        <mc:AlternateContent>
+          <mc:Choice Requires="w16se">
+            <w16se:symEx w16se:font="Segoe UI Emoji" w16se:char="1F63D"/>
+          </mc:Choice>
+          <mc:Fallback>
+            <w:t>😽</w:t>
+          </mc:Fallback>
+        </mc:AlternateContent>
+      </w:r>
+      <w:r>
+        <w:rPr>
+          <mc:AlternateContent>
+            <mc:Choice Requires="w16se"/>
+            <mc:Fallback>
+              <w:rFonts w:ascii="Segoe UI Emoji" w:eastAsia="Segoe UI Emoji" w:hAnsi="Segoe UI Emoji" w:cs="Segoe UI Emoji"/>
+            </mc:Fallback>
+          </mc:AlternateContent>
+          <w:lang w:val="en-US"/>
+        </w:rPr>
+        <mc:AlternateContent>
+          <mc:Choice Requires="w16se">
+            <w16se:symEx w16se:font="Segoe UI Emoji" w16se:char="1F63D"/>
+          </mc:Choice>
+          <mc:Fallback>
+            <w:t>😽</w:t>
+          </mc:Fallback>
+        </mc:AlternateContent>
+      </w:r>
+      <w:r>
+        <w:rPr>
+          <mc:AlternateContent>
+            <mc:Choice Requires="w16se"/>
+            <mc:Fallback>
+              <w:rFonts w:ascii="Segoe UI Emoji" w:eastAsia="Segoe UI Emoji" w:hAnsi="Segoe UI Emoji" w:cs="Segoe UI Emoji"/>
+            </mc:Fallback>
+          </mc:AlternateContent>
+          <w:lang w:val="en-US"/>
+        </w:rPr>
+        <mc:AlternateContent>
+          <mc:Choice Requires="w16se">
+            <w16se:symEx w16se:font="Segoe UI Emoji" w16se:char="1F63D"/>
+          </mc:Choice>
+          <mc:Fallback>
+            <w:t>😽</w:t>
+          </mc:Fallback>
+        </mc:AlternateContent>
+      </w:r>
+      <w:r>
+        <w:rPr>
+          <mc:AlternateContent>
+            <mc:Choice Requires="w16se"/>
+            <mc:Fallback>
+              <w:rFonts w:ascii="Segoe UI Emoji" w:eastAsia="Segoe UI Emoji" w:hAnsi="Segoe UI Emoji" w:cs="Segoe UI Emoji"/>
+            </mc:Fallback>
+          </mc:AlternateContent>
+          <w:lang w:val="en-US"/>
+        </w:rPr>
+        <mc:AlternateContent>
+          <mc:Choice Requires="w16se">
+            <w16se:symEx w16se:font="Segoe UI Emoji" w16se:char="1F63D"/>
+          </mc:Choice>
+          <mc:Fallback>
+            <w:t>😽</w:t>
+          </mc:Fallback>
+        </mc:AlternateContent>
+      </w:r>
+      <w:r>
+        <w:rPr>
+          <mc:AlternateContent>
+            <mc:Choice Requires="w16se"/>
+            <mc:Fallback>
+              <w:rFonts w:ascii="Segoe UI Emoji" w:eastAsia="Segoe UI Emoji" w:hAnsi="Segoe UI Emoji" w:cs="Segoe UI Emoji"/>
+            </mc:Fallback>
+          </mc:AlternateContent>
+          <w:lang w:val="en-US"/>
+        </w:rPr>
+        <mc:AlternateContent>
+          <mc:Choice Requires="w16se">
+            <w16se:symEx w16se:font="Segoe UI Emoji" w16se:char="1F63D"/>
+          </mc:Choice>
+          <mc:Fallback>
+            <w:t>😽</w:t>
+          </mc:Fallback>
+        </mc:AlternateContent>
+      </w:r>
+      <w:r>
+        <w:rPr>
+          <mc:AlternateContent>
+            <mc:Choice Requires="w16se"/>
+            <mc:Fallback>
+              <w:rFonts w:ascii="Segoe UI Emoji" w:eastAsia="Segoe UI Emoji" w:hAnsi="Segoe UI Emoji" w:cs="Segoe UI Emoji"/>
+            </mc:Fallback>
+          </mc:AlternateContent>
+          <w:lang w:val="en-US"/>
+        </w:rPr>
+        <mc:AlternateContent>
+          <mc:Choice Requires="w16se">
+            <w16se:symEx w16se:font="Segoe UI Emoji" w16se:char="1F63D"/>
+          </mc:Choice>
+          <mc:Fallback>
+            <w:t>😽</w:t>
+          </mc:Fallback>
+        </mc:AlternateContent>
+      </w:r>
+      <w:r>
+        <w:rPr>
+          <mc:AlternateContent>
+            <mc:Choice Requires="w16se"/>
+            <mc:Fallback>
+              <w:rFonts w:ascii="Segoe UI Emoji" w:eastAsia="Segoe UI Emoji" w:hAnsi="Segoe UI Emoji" w:cs="Segoe UI Emoji"/>
+            </mc:Fallback>
+          </mc:AlternateContent>
+          <w:lang w:val="en-US"/>
+        </w:rPr>
+        <mc:AlternateContent>
+          <mc:Choice Requires="w16se">
+            <w16se:symEx w16se:font="Segoe UI Emoji" w16se:char="1F63D"/>
+          </mc:Choice>
+          <mc:Fallback>
+            <w:t>😽</w:t>
+          </mc:Fallback>
+        </mc:AlternateContent>
+      </w:r>
+      <w:r>
+        <w:rPr>
+          <mc:AlternateContent>
+            <mc:Choice Requires="w16se"/>
+            <mc:Fallback>
+              <w:rFonts w:ascii="Segoe UI Emoji" w:eastAsia="Segoe UI Emoji" w:hAnsi="Segoe UI Emoji" w:cs="Segoe UI Emoji"/>
+            </mc:Fallback>
+          </mc:AlternateContent>
+          <w:lang w:val="en-US"/>
+        </w:rPr>
+        <mc:AlternateContent>
+          <mc:Choice Requires="w16se">
+            <w16se:symEx w16se:font="Segoe UI Emoji" w16se:char="1F63D"/>
+          </mc:Choice>
+          <mc:Fallback>
+            <w:t>😽</w:t>
+          </mc:Fallback>
+        </mc:AlternateContent>
+      </w:r>
+      <w:r>
+        <w:rPr>
+          <mc:AlternateContent>
+            <mc:Choice Requires="w16se"/>
+            <mc:Fallback>
+              <w:rFonts w:ascii="Segoe UI Emoji" w:eastAsia="Segoe UI Emoji" w:hAnsi="Segoe UI Emoji" w:cs="Segoe UI Emoji"/>
+            </mc:Fallback>
+          </mc:AlternateContent>
+          <w:lang w:val="en-US"/>
+        </w:rPr>
+        <mc:AlternateContent>
+          <mc:Choice Requires="w16se">
+            <w16se:symEx w16se:font="Segoe UI Emoji" w16se:char="1F63D"/>
+          </mc:Choice>
+          <mc:Fallback>
+            <w:t>😽</w:t>
+          </mc:Fallback>
+        </mc:AlternateContent>
+      </w:r>
+      <w:r>
+        <w:rPr>
+          <mc:AlternateContent>
+            <mc:Choice Requires="w16se"/>
+            <mc:Fallback>
+              <w:rFonts w:ascii="Segoe UI Emoji" w:eastAsia="Segoe UI Emoji" w:hAnsi="Segoe UI Emoji" w:cs="Segoe UI Emoji"/>
+            </mc:Fallback>
+          </mc:AlternateContent>
+          <w:lang w:val="en-US"/>
+        </w:rPr>
+        <mc:AlternateContent>
+          <mc:Choice Requires="w16se">
+            <w16se:symEx w16se:font="Segoe UI Emoji" w16se:char="1F63D"/>
+          </mc:Choice>
+          <mc:Fallback>
+            <w:t>😽</w:t>
+          </mc:Fallback>
+        </mc:AlternateContent>
+      </w:r>
+      <w:r>
+        <w:rPr>
+          <mc:AlternateContent>
+            <mc:Choice Requires="w16se"/>
+            <mc:Fallback>
+              <w:rFonts w:ascii="Segoe UI Emoji" w:eastAsia="Segoe UI Emoji" w:hAnsi="Segoe UI Emoji" w:cs="Segoe UI Emoji"/>
+            </mc:Fallback>
+          </mc:AlternateContent>
+          <w:lang w:val="en-US"/>
+        </w:rPr>
+        <mc:AlternateContent>
+          <mc:Choice Requires="w16se">
+            <w16se:symEx w16se:font="Segoe UI Emoji" w16se:char="1F63D"/>
+          </mc:Choice>
+          <mc:Fallback>
+            <w:t>😽</w:t>
+          </mc:Fallback>
+        </mc:AlternateContent>
+      </w:r>
+      <w:r>
+        <w:rPr>
+          <mc:AlternateContent>
+            <mc:Choice Requires="w16se"/>
+            <mc:Fallback>
+              <w:rFonts w:ascii="Segoe UI Emoji" w:eastAsia="Segoe UI Emoji" w:hAnsi="Segoe UI Emoji" w:cs="Segoe UI Emoji"/>
+            </mc:Fallback>
+          </mc:AlternateContent>
+          <w:lang w:val="en-US"/>
+        </w:rPr>
+        <mc:AlternateContent>
+          <mc:Choice Requires="w16se">
+            <w16se:symEx w16se:font="Segoe UI Emoji" w16se:char="1F63D"/>
+          </mc:Choice>
+          <mc:Fallback>
+            <w:t>😽</w:t>
+          </mc:Fallback>
+        </mc:AlternateContent>
+      </w:r>
+      <w:r>
+        <w:rPr>
+          <mc:AlternateContent>
+            <mc:Choice Requires="w16se"/>
+            <mc:Fallback>
+              <w:rFonts w:ascii="Segoe UI Emoji" w:eastAsia="Segoe UI Emoji" w:hAnsi="Segoe UI Emoji" w:cs="Segoe UI Emoji"/>
+            </mc:Fallback>
+          </mc:AlternateContent>
+          <w:lang w:val="en-US"/>
+        </w:rPr>
+        <mc:AlternateContent>
+          <mc:Choice Requires="w16se">
+            <w16se:symEx w16se:font="Segoe UI Emoji" w16se:char="1F63D"/>
+          </mc:Choice>
+          <mc:Fallback>
+            <w:t>😽</w:t>
+          </mc:Fallback>
+        </mc:AlternateContent>
+      </w:r>
+      <w:r>
+        <w:rPr>
+          <mc:AlternateContent>
+            <mc:Choice Requires="w16se"/>
+            <mc:Fallback>
+              <w:rFonts w:ascii="Segoe UI Emoji" w:eastAsia="Segoe UI Emoji" w:hAnsi="Segoe UI Emoji" w:cs="Segoe UI Emoji"/>
+            </mc:Fallback>
+          </mc:AlternateContent>
+          <w:lang w:val="en-US"/>
+        </w:rPr>
+        <mc:AlternateContent>
+          <mc:Choice Requires="w16se">
+            <w16se:symEx w16se:font="Segoe UI Emoji" w16se:char="1F63D"/>
+          </mc:Choice>
+          <mc:Fallback>
+            <w:t>😽</w:t>
+          </mc:Fallback>
+        </mc:AlternateContent>
+      </w:r>
+      <w:r>
+        <w:rPr>
+          <mc:AlternateContent>
+            <mc:Choice Requires="w16se"/>
+            <mc:Fallback>
+              <w:rFonts w:ascii="Segoe UI Emoji" w:eastAsia="Segoe UI Emoji" w:hAnsi="Segoe UI Emoji" w:cs="Segoe UI Emoji"/>
+            </mc:Fallback>
+          </mc:AlternateContent>
+          <w:lang w:val="en-US"/>
+        </w:rPr>
+        <mc:AlternateContent>
+          <mc:Choice Requires="w16se">
+            <w16se:symEx w16se:font="Segoe UI Emoji" w16se:char="1F63D"/>
+          </mc:Choice>
+          <mc:Fallback>
+            <w:t>😽</w:t>
+          </mc:Fallback>
+        </mc:AlternateContent>
+      </w:r>
+      <w:r>
+        <w:rPr>
+          <mc:AlternateContent>
+            <mc:Choice Requires="w16se"/>
+            <mc:Fallback>
+              <w:rFonts w:ascii="Segoe UI Emoji" w:eastAsia="Segoe UI Emoji" w:hAnsi="Segoe UI Emoji" w:cs="Segoe UI Emoji"/>
+            </mc:Fallback>
+          </mc:AlternateContent>
+          <w:lang w:val="en-US"/>
+        </w:rPr>
+        <mc:AlternateContent>
+          <mc:Choice Requires="w16se">
+            <w16se:symEx w16se:font="Segoe UI Emoji" w16se:char="1F63D"/>
+          </mc:Choice>
+          <mc:Fallback>
+            <w:t>😽</w:t>
+          </mc:Fallback>
+        </mc:AlternateContent>
+      </w:r>
+      <w:r>
+        <w:rPr>
+          <mc:AlternateContent>
+            <mc:Choice Requires="w16se"/>
+            <mc:Fallback>
+              <w:rFonts w:ascii="Segoe UI Emoji" w:eastAsia="Segoe UI Emoji" w:hAnsi="Segoe UI Emoji" w:cs="Segoe UI Emoji"/>
+            </mc:Fallback>
+          </mc:AlternateContent>
+          <w:lang w:val="en-US"/>
+        </w:rPr>
+        <mc:AlternateContent>
+          <mc:Choice Requires="w16se">
+            <w16se:symEx w16se:font="Segoe UI Emoji" w16se:char="1F63D"/>
+          </mc:Choice>
+          <mc:Fallback>
+            <w:t>😽</w:t>
+          </mc:Fallback>
+        </mc:AlternateContent>
+      </w:r>
+    </w:p>
+    <w:p>
+      <w:pPr>
+        <w:rPr>
+          <w:lang w:val="en-US"/>
+        </w:rPr>
+      </w:pPr>
+      <w:r>
+        <w:rPr>
+          <w:b/>
+          <w:bCs/>
+        </w:rPr>
+        <w:t>Висновок</w:t>
+      </w:r>
+      <w:r>
+        <w:rPr>
+          <w:b/>
+          <w:bCs/>
+          <w:lang w:val="en-US"/>
+        </w:rPr>
+        <w:t>:</w:t>
+      </w:r>
+      <w:r>
+        <w:rPr>
+          <w:b/>
+          <w:bCs/>
+          <w:lang w:val="en-US"/>
+        </w:rPr>
         <w:t xml:space="preserve"> </w:t>
       </w:r>
       <w:r>
         <w:t>у ході виконання лабораторної роботи була виконана лабораторна робота і було зроблено і вивчено все що пише в меті.</w:t>
       </w:r>
-    </w:p>
-    <w:p>
-      <w:pPr>
-        <w:rPr>
-          <w:lang w:val="en-US"/>
-        </w:rPr>
-      </w:pPr>
-      <w:hyperlink r:id="rId5" w:history="1">
+      <w:r>
+        <w:rPr>
+          <w:lang w:val="en-US"/>
+        </w:rPr>
+        <w:t xml:space="preserve"> </w:t>
+      </w:r>
+      <w:r>
+        <w:t xml:space="preserve">І </w:t>
+      </w:r>
+      <w:r>
+        <w:t xml:space="preserve">було переглянуто багато картинок </w:t>
+      </w:r>
+      <w:r>
+        <w:t>котик</w:t>
+      </w:r>
+      <w:r>
+        <w:t xml:space="preserve">ів. </w:t>
+      </w:r>
+      <w:r>
+        <w:rPr>
+          <mc:AlternateContent>
+            <mc:Choice Requires="w16se"/>
+            <mc:Fallback>
+              <w:rFonts w:ascii="Segoe UI Emoji" w:eastAsia="Segoe UI Emoji" w:hAnsi="Segoe UI Emoji" w:cs="Segoe UI Emoji"/>
+            </mc:Fallback>
+          </mc:AlternateContent>
+          <w:lang w:val="en-US"/>
+        </w:rPr>
+        <mc:AlternateContent>
+          <mc:Choice Requires="w16se">
+            <w16se:symEx w16se:font="Segoe UI Emoji" w16se:char="1F63D"/>
+          </mc:Choice>
+          <mc:Fallback>
+            <w:t>😽</w:t>
+          </mc:Fallback>
+        </mc:AlternateContent>
+      </w:r>
+    </w:p>
+    <w:p>
+      <w:pPr>
+        <w:rPr>
+          <w:lang w:val="en-US"/>
+        </w:rPr>
+      </w:pPr>
+      <w:hyperlink r:id="rId9" w:history="1">
         <w:r>
           <w:rPr>
             <w:rStyle w:val="Hyperlink"/>
@@ -1004,6 +4210,7 @@
   <w:style w:type="paragraph" w:default="1" w:styleId="Normal">
     <w:name w:val="Normal"/>
     <w:qFormat/>
+    <w:rsid w:val="002F6854"/>
   </w:style>
   <w:style w:type="paragraph" w:styleId="Heading1">
     <w:name w:val="heading 1"/>

</xml_diff>